<commit_message>
Dokumentasi tier berat dan pengujian: buku, README, dokumen audit
Buku dokumentasi dibangun ulang (Markdown + PDF/DOCX/PPTX): panduan tier
1.700.000, variabel lingkungan DOMINO_THREADS / DOMINO_MAX_ENGINE /
DOMINO_ENGINE_WAIT, daftar alat audit, serta bagian pengujian yang kini
memuat 29 tes server, 8 tes paralel/determinisme, dan 6 uji antarmuka tanpa
kepala. README menambah jalur pengujian dan alat audit.

Baru: docs/audit-kualitas-kode.md — temuan audit (crash pool kosong, alokasi di
jalur panas, simulasi satu inti, antrean server, cache-first) beserta angka ukur
dan batasannya.
</commit_message>
<xml_diff>
--- a/docs/Domino-Analyzer-Pro-Dokumentasi.docx
+++ b/docs/Domino-Analyzer-Pro-Dokumentasi.docx
@@ -20,7 +20,7 @@
     </w:p>
     <w:p>
       <w:r>
-        <w:t>by Dody Maulana Ramadhan  |  Versi aplikasi v3.3 · engine 3.0.0  |  Build 2026-10-12</w:t>
+        <w:t>by Dody Maulana Ramadhan  |  Versi aplikasi v3.3 · engine 3.0.0  |  Build 2026-10-15</w:t>
       </w:r>
     </w:p>
     <w:p>
@@ -4535,6 +4535,102 @@
           </w:p>
         </w:tc>
       </w:tr>
+      <w:tr>
+        <w:tc>
+          <w:tcPr>
+            <w:tcW w:type="dxa" w:w="2880"/>
+          </w:tcPr>
+          <w:p>
+            <w:r>
+              <w:t>DOMINO_THREADS</w:t>
+            </w:r>
+          </w:p>
+        </w:tc>
+        <w:tc>
+          <w:tcPr>
+            <w:tcW w:type="dxa" w:w="2880"/>
+          </w:tcPr>
+          <w:p>
+            <w:r>
+              <w:t>semua inti logis (maks 32)</w:t>
+            </w:r>
+          </w:p>
+        </w:tc>
+        <w:tc>
+          <w:tcPr>
+            <w:tcW w:type="dxa" w:w="2880"/>
+          </w:tcPr>
+          <w:p>
+            <w:r>
+              <w:t>jumlah thread mesin C++ untuk menjalankan simulasi. 1 = sekuensial. Hasilnya identik pada jumlah thread berapa pun</w:t>
+            </w:r>
+          </w:p>
+        </w:tc>
+      </w:tr>
+      <w:tr>
+        <w:tc>
+          <w:tcPr>
+            <w:tcW w:type="dxa" w:w="2880"/>
+          </w:tcPr>
+          <w:p>
+            <w:r>
+              <w:t>DOMINO_MAX_ENGINE</w:t>
+            </w:r>
+          </w:p>
+        </w:tc>
+        <w:tc>
+          <w:tcPr>
+            <w:tcW w:type="dxa" w:w="2880"/>
+          </w:tcPr>
+          <w:p>
+            <w:r>
+              <w:t>1</w:t>
+            </w:r>
+          </w:p>
+        </w:tc>
+        <w:tc>
+          <w:tcPr>
+            <w:tcW w:type="dxa" w:w="2880"/>
+          </w:tcPr>
+          <w:p>
+            <w:r>
+              <w:t>berapa proses mesin boleh berjalan bersamaan. 1 = permintaan diantrekan supaya tiap analisis memakai seluruh inti CPU</w:t>
+            </w:r>
+          </w:p>
+        </w:tc>
+      </w:tr>
+      <w:tr>
+        <w:tc>
+          <w:tcPr>
+            <w:tcW w:type="dxa" w:w="2880"/>
+          </w:tcPr>
+          <w:p>
+            <w:r>
+              <w:t>DOMINO_ENGINE_WAIT</w:t>
+            </w:r>
+          </w:p>
+        </w:tc>
+        <w:tc>
+          <w:tcPr>
+            <w:tcW w:type="dxa" w:w="2880"/>
+          </w:tcPr>
+          <w:p>
+            <w:r>
+              <w:t>60</w:t>
+            </w:r>
+          </w:p>
+        </w:tc>
+        <w:tc>
+          <w:tcPr>
+            <w:tcW w:type="dxa" w:w="2880"/>
+          </w:tcPr>
+          <w:p>
+            <w:r>
+              <w:t>batas tunggu (detik) dalam antrean mesin sebelum server menjawab 503</w:t>
+            </w:r>
+          </w:p>
+        </w:tc>
+      </w:tr>
     </w:tbl>
     <w:p>
       <w:r>
@@ -4558,6 +4654,27 @@
       </w:r>
     </w:p>
     <w:p>
+      <w:r>
+        <w:rPr>
+          <w:b w:val="0"/>
+          <w:i w:val="0"/>
+        </w:rPr>
+        <w:t>Contoh menahan mesin agar memakai 4 thread saja (komputer dipakai kerja lain):</w:t>
+      </w:r>
+    </w:p>
+    <w:p>
+      <w:pPr>
+        <w:ind w:left="240"/>
+      </w:pPr>
+      <w:r>
+        <w:rPr>
+          <w:rFonts w:ascii="Consolas" w:hAnsi="Consolas"/>
+          <w:sz w:val="17"/>
+        </w:rPr>
+        <w:t>DOMINO_THREADS=4 python start.py</w:t>
+      </w:r>
+    </w:p>
+    <w:p>
       <w:pPr>
         <w:ind w:left="360"/>
       </w:pPr>
@@ -4576,7 +4693,7 @@
         <w:rPr>
           <w:i/>
         </w:rPr>
-        <w:t>Peringatan keamanan. HOST=0.0.0.0 membuat aplikasi bisa diakses siapa pun di jaringan yang sama, dan setiap permintaan analisis membebani CPU komputer Anda. Endpoint analisis memang dibatasi (maksimum 10.000 simulasi per permintaan), tetapi tetap lebih aman membiarkannya di 127.0.0.1 kecuali Anda memang membutuhkan akses dari perangkat lain.</w:t>
+        <w:t>Peringatan keamanan. HOST=0.0.0.0 membuat aplikasi bisa diakses siapa pun di jaringan yang sama, dan setiap permintaan analisis membebani CPU komputer Anda. Endpoint analisis memang dibatasi (maksimum 1.700.000 simulasi per permintaan), tetapi tetap lebih aman membiarkannya di 127.0.0.1 kecuali Anda memang membutuhkan akses dari perangkat lain.</w:t>
       </w:r>
     </w:p>
     <w:p>
@@ -4877,7 +4994,7 @@
           <w:b w:val="0"/>
           <w:i w:val="0"/>
         </w:rPr>
-        <w:t xml:space="preserve"> Batas 10.000 simulasi per permintaan</w:t>
+        <w:t xml:space="preserve"> Batas 1.700.000 simulasi per permintaan</w:t>
       </w:r>
     </w:p>
     <w:p>
@@ -5212,7 +5329,17 @@
         <w:br/>
         <w:t>│   ├── selftest.py           menjalankan pemeriksaan mandiri mesin</w:t>
         <w:br/>
-        <w:t>│   ├── test_server.py        uji unit server (27 tes)</w:t>
+        <w:t>│   ├── test_server.py        uji unit server (29 tes)</w:t>
+        <w:br/>
+        <w:t>│   ├── test_engine_parallel.py  uji paralel/determinisme mesin (beban penuh: DOMINO_SLOW_TESTS=1)</w:t>
+        <w:br/>
+        <w:t>│   ├── test_ui_heavy.py      uji antarmuka tanpa kepala untuk tier 1,7 juta (perlu playwright)</w:t>
+        <w:br/>
+        <w:t>│   ├── build_baseline.py     bangun mesin dari git HEAD + rekam hasil golden</w:t>
+        <w:br/>
+        <w:t>│   ├── audit_golden.py       bandingkan keluaran mesin byte-per-byte dengan HEAD</w:t>
+        <w:br/>
+        <w:t>│   ├── bench_engine.py       ukur kecepatan: HEAD vs 1 thread vs paralel</w:t>
         <w:br/>
         <w:t>│   ├── build_docs.py         pembangun buku dokumentasi ini (Markdown, PDF, DOCX)</w:t>
         <w:br/>
@@ -5260,7 +5387,7 @@
           <w:b w:val="0"/>
           <w:i w:val="0"/>
         </w:rPr>
-        <w:t>Tiga perintah yang membuktikan pemasangan berjalan benar:</w:t>
+        <w:t>Lima perintah yang membuktikan pemasangan berjalan benar:</w:t>
       </w:r>
     </w:p>
     <w:p>
@@ -5274,7 +5401,13 @@
         </w:rPr>
         <w:t>python tools/selftest.py      # 11 pemeriksaan mandiri mesin</w:t>
         <w:br/>
-        <w:t>python tools/test_server.py   # 27 uji unit server (butuh mesin untuk tes end-to-end)</w:t>
+        <w:t>python tools/test_server.py   # 29 uji unit server (butuh mesin untuk tes end-to-end)</w:t>
+        <w:br/>
+        <w:t>python tools/test_engine_parallel.py   # 8 uji paralel/determinisme (4 di antaranya beban penuh, perlu DOMINO_SLOW_TESTS=1)</w:t>
+        <w:br/>
+        <w:t>python tools/test_ui_heavy.py # 6 uji antarmuka tanpa kepala untuk tier 1,7 juta</w:t>
+        <w:br/>
+        <w:t xml:space="preserve">                              #   (perlu `pip install playwright`; dilewati bila tak ada peramban)</w:t>
         <w:br/>
         <w:t>python start.py --check       # build + selftest saja, tanpa menjalankan server</w:t>
       </w:r>
@@ -5285,7 +5418,7 @@
           <w:b w:val="0"/>
           <w:i w:val="0"/>
         </w:rPr>
-        <w:t>Bila ketiganya keluar dengan kode 0 dan mencetak "OK" atau "semua check LOLOS", pemasangan Anda sudah lengkap. Bagian VII menjelaskan apa yang sebenarnya diperiksa oleh masing-masing perintah.</w:t>
+        <w:t>Bila semuanya keluar dengan kode 0 dan mencetak "OK" atau "semua check LOLOS", pemasangan Anda sudah lengkap. Bagian VII menjelaskan apa yang sebenarnya diperiksa oleh masing-masing perintah.</w:t>
       </w:r>
     </w:p>
     <w:p>
@@ -5870,7 +6003,7 @@
           </w:tcPr>
           <w:p>
             <w:r>
-              <w:t>500, 1000, 2000, 5000</w:t>
+              <w:t>1000, 5000, 10000, 50000, 1.700.000</w:t>
             </w:r>
           </w:p>
         </w:tc>
@@ -5880,7 +6013,7 @@
           </w:tcPr>
           <w:p>
             <w:r>
-              <w:t>2000</w:t>
+              <w:t>10000</w:t>
             </w:r>
           </w:p>
         </w:tc>
@@ -5890,7 +6023,7 @@
           </w:tcPr>
           <w:p>
             <w:r>
-              <w:t>seberapa banyak gim yang disimulasikan untuk setiap kandidat langkah</w:t>
+              <w:t>seberapa banyak gim yang disimulasikan untuk setiap kandidat langkah; 50.000 ≈ 95% ±0,4%; 1.700.000 ≈ 95% ±0,1% (paling akurat, paling lambat — lihat peringatan di bawah)</w:t>
             </w:r>
           </w:p>
         </w:tc>
@@ -6213,7 +6346,7 @@
           </w:tcPr>
           <w:p>
             <w:r>
-              <w:t>500</w:t>
+              <w:t>1000</w:t>
             </w:r>
           </w:p>
         </w:tc>
@@ -6245,7 +6378,7 @@
           </w:tcPr>
           <w:p>
             <w:r>
-              <w:t>1000</w:t>
+              <w:t>5000</w:t>
             </w:r>
           </w:p>
         </w:tc>
@@ -6277,7 +6410,7 @@
           </w:tcPr>
           <w:p>
             <w:r>
-              <w:t>2000 (bawaan)</w:t>
+              <w:t>10000 (bawaan)</w:t>
             </w:r>
           </w:p>
         </w:tc>
@@ -6309,17 +6442,17 @@
           </w:tcPr>
           <w:p>
             <w:r>
-              <w:t>5000</w:t>
-            </w:r>
-          </w:p>
-        </w:tc>
-        <w:tc>
-          <w:tcPr>
-            <w:tcW w:type="dxa" w:w="2880"/>
-          </w:tcPr>
-          <w:p>
-            <w:r>
-              <w:t>paling lama</w:t>
+              <w:t>50000</w:t>
+            </w:r>
+          </w:p>
+        </w:tc>
+        <w:tc>
+          <w:tcPr>
+            <w:tcW w:type="dxa" w:w="2880"/>
+          </w:tcPr>
+          <w:p>
+            <w:r>
+              <w:t>hitungan detik</w:t>
             </w:r>
           </w:p>
         </w:tc>
@@ -6330,6 +6463,38 @@
           <w:p>
             <w:r>
               <w:t>keputusan besar, atau saat Anda ingin membaca selisih tipis</w:t>
+            </w:r>
+          </w:p>
+        </w:tc>
+      </w:tr>
+      <w:tr>
+        <w:tc>
+          <w:tcPr>
+            <w:tcW w:type="dxa" w:w="2880"/>
+          </w:tcPr>
+          <w:p>
+            <w:r>
+              <w:t>1.700.000</w:t>
+            </w:r>
+          </w:p>
+        </w:tc>
+        <w:tc>
+          <w:tcPr>
+            <w:tcW w:type="dxa" w:w="2880"/>
+          </w:tcPr>
+          <w:p>
+            <w:r>
+              <w:t>puluhan detik (peringatan aktif)</w:t>
+            </w:r>
+          </w:p>
+        </w:tc>
+        <w:tc>
+          <w:tcPr>
+            <w:tcW w:type="dxa" w:w="2880"/>
+          </w:tcPr>
+          <w:p>
+            <w:r>
+              <w:t>keputusan paling penting; interval keyakinan menyempit sampai ±0,1% sehingga selisih kecil antar langkah benar-benar bisa dipercaya</w:t>
             </w:r>
           </w:p>
         </w:tc>
@@ -6341,7 +6506,439 @@
           <w:b w:val="0"/>
           <w:i w:val="0"/>
         </w:rPr>
-        <w:t>Semakin banyak simulasi, semakin sempit interval keyakinan, sehingga perbedaan kecil antar langkah bisa Anda percayai. Sebaliknya, pada 500 simulasi, selisih dua persen tidak berarti apa-apa. Bab tentang interval keyakinan di Bagian V menjelaskan hal ini dengan angka.</w:t>
+        <w:t>Semakin banyak simulasi, semakin sempit interval keyakinan, sehingga perbedaan kecil antar langkah bisa Anda percayai. Sebaliknya, pada 1000 simulasi, selisih dua persen tidak berarti apa-apa. Bab tentang interval keyakinan di Bagian V menjelaskan hal ini dengan angka.</w:t>
+      </w:r>
+    </w:p>
+    <w:p>
+      <w:pPr>
+        <w:pStyle w:val="Heading3"/>
+      </w:pPr>
+      <w:r>
+        <w:t>Tier 1.700.000 simulasi: peringatan dan aturan mainnya</w:t>
+      </w:r>
+    </w:p>
+    <w:p>
+      <w:r>
+        <w:rPr>
+          <w:b w:val="0"/>
+          <w:i w:val="0"/>
+        </w:rPr>
+        <w:t xml:space="preserve">Tier tertinggi memberi interval paling sempit (≈95% ±0,1%), tetapi satu analisis memakai </w:t>
+      </w:r>
+      <w:r>
+        <w:rPr>
+          <w:b/>
+          <w:i w:val="0"/>
+        </w:rPr>
+        <w:t>seluruh inti CPU selama puluhan detik</w:t>
+      </w:r>
+      <w:r>
+        <w:rPr>
+          <w:b w:val="0"/>
+          <w:i w:val="0"/>
+        </w:rPr>
+        <w:t>. Empat hal berikut menjaganya tetap nyaman:</w:t>
+      </w:r>
+    </w:p>
+    <w:tbl>
+      <w:tblPr>
+        <w:tblStyle w:val="LightGrid-Accent1"/>
+        <w:tblW w:type="auto" w:w="0"/>
+        <w:tblLook w:firstColumn="1" w:firstRow="1" w:lastColumn="0" w:lastRow="0" w:noHBand="0" w:noVBand="1" w:val="04A0"/>
+      </w:tblPr>
+      <w:tblGrid>
+        <w:gridCol w:w="4320"/>
+        <w:gridCol w:w="4320"/>
+      </w:tblGrid>
+      <w:tr>
+        <w:tc>
+          <w:tcPr>
+            <w:tcW w:type="dxa" w:w="4320"/>
+          </w:tcPr>
+          <w:p>
+            <w:r>
+              <w:rPr>
+                <w:b/>
+              </w:rPr>
+              <w:t>Perilaku</w:t>
+            </w:r>
+          </w:p>
+        </w:tc>
+        <w:tc>
+          <w:tcPr>
+            <w:tcW w:type="dxa" w:w="4320"/>
+          </w:tcPr>
+          <w:p>
+            <w:r>
+              <w:rPr>
+                <w:b/>
+              </w:rPr>
+              <w:t>Penjelasan</w:t>
+            </w:r>
+          </w:p>
+        </w:tc>
+      </w:tr>
+      <w:tr>
+        <w:tc>
+          <w:tcPr>
+            <w:tcW w:type="dxa" w:w="4320"/>
+          </w:tcPr>
+          <w:p>
+            <w:r>
+              <w:t>Konfirmasi sebelum dipakai</w:t>
+            </w:r>
+          </w:p>
+        </w:tc>
+        <w:tc>
+          <w:tcPr>
+            <w:tcW w:type="dxa" w:w="4320"/>
+          </w:tcPr>
+          <w:p>
+            <w:r>
+              <w:t>saat Anda memilih 1.700.000, aplikasi menampilkan peringatan berisi perkiraan waktunya. Menolak akan mengembalikan pilihan sebelumnya</w:t>
+            </w:r>
+          </w:p>
+        </w:tc>
+      </w:tr>
+      <w:tr>
+        <w:tc>
+          <w:tcPr>
+            <w:tcW w:type="dxa" w:w="4320"/>
+          </w:tcPr>
+          <w:p>
+            <w:r>
+              <w:t>Peringatan tetap terlihat</w:t>
+            </w:r>
+          </w:p>
+        </w:tc>
+        <w:tc>
+          <w:tcPr>
+            <w:tcW w:type="dxa" w:w="4320"/>
+          </w:tcPr>
+          <w:p>
+            <w:r>
+              <w:t>selama tier ini aktif, banner kuning di bawah panel Setup menyebutkan perkiraan waktu untuk posisi Anda saat ini (dihitung dari jumlah kandidat langkah × jumlah simulasi × jumlah inti komputer)</w:t>
+            </w:r>
+          </w:p>
+        </w:tc>
+      </w:tr>
+      <w:tr>
+        <w:tc>
+          <w:tcPr>
+            <w:tcW w:type="dxa" w:w="4320"/>
+          </w:tcPr>
+          <w:p>
+            <w:r>
+              <w:t>Mode Live dimatikan</w:t>
+            </w:r>
+          </w:p>
+        </w:tc>
+        <w:tc>
+          <w:tcPr>
+            <w:tcW w:type="dxa" w:w="4320"/>
+          </w:tcPr>
+          <w:p>
+            <w:r>
+              <w:t>analisis tidak dijalankan otomatis setiap kali Anda menempatkan kartu. Tanpa aturan ini, setiap langkah memicu 1,7 juta simulasi baru dan CPU tidak pernah berhenti</w:t>
+            </w:r>
+          </w:p>
+        </w:tc>
+      </w:tr>
+      <w:tr>
+        <w:tc>
+          <w:tcPr>
+            <w:tcW w:type="dxa" w:w="4320"/>
+          </w:tcPr>
+          <w:p>
+            <w:r>
+              <w:t>Tombol Batal benar-benar menghentikan</w:t>
+            </w:r>
+          </w:p>
+        </w:tc>
+        <w:tc>
+          <w:tcPr>
+            <w:tcW w:type="dxa" w:w="4320"/>
+          </w:tcPr>
+          <w:p>
+            <w:r>
+              <w:t>menekan Batal saat analisis berjalan tidak hanya membatalkan tampilan hasil — server menghentikan proses mesinnya, sehingga CPU langsung bebas</w:t>
+            </w:r>
+          </w:p>
+        </w:tc>
+      </w:tr>
+      <w:tr>
+        <w:tc>
+          <w:tcPr>
+            <w:tcW w:type="dxa" w:w="4320"/>
+          </w:tcPr>
+          <w:p>
+            <w:r>
+              <w:t>Label tombol tidak menipu</w:t>
+            </w:r>
+          </w:p>
+        </w:tc>
+        <w:tc>
+          <w:tcPr>
+            <w:tcW w:type="dxa" w:w="4320"/>
+          </w:tcPr>
+          <w:p>
+            <w:r>
+              <w:t>teks tombol selalu mengikuti tier yang sedang dipilih: memilih tier berat mengubahnya menjadi "Analisis 1,7 jt (sekali)", dan menurunkannya kembali mengembalikannya ke "Analisis Live"</w:t>
+            </w:r>
+          </w:p>
+        </w:tc>
+      </w:tr>
+      <w:tr>
+        <w:tc>
+          <w:tcPr>
+            <w:tcW w:type="dxa" w:w="4320"/>
+          </w:tcPr>
+          <w:p>
+            <w:r>
+              <w:t>Live dihidupkan lagi hanya kalau tadi ia yang mematikannya</w:t>
+            </w:r>
+          </w:p>
+        </w:tc>
+        <w:tc>
+          <w:tcPr>
+            <w:tcW w:type="dxa" w:w="4320"/>
+          </w:tcPr>
+          <w:p>
+            <w:r>
+              <w:t>menurunkan tier dari 1,7 juta menyalakan Live kembali otomatis; tetapi bila Anda sendiri yang menjeda Live, ia tetap jeda — aplikasi tidak mengambil alih keputusan Anda</w:t>
+            </w:r>
+          </w:p>
+        </w:tc>
+      </w:tr>
+      <w:tr>
+        <w:tc>
+          <w:tcPr>
+            <w:tcW w:type="dxa" w:w="4320"/>
+          </w:tcPr>
+          <w:p>
+            <w:r>
+              <w:t>Sesi yang diimpor ikut diperingatkan</w:t>
+            </w:r>
+          </w:p>
+        </w:tc>
+        <w:tc>
+          <w:tcPr>
+            <w:tcW w:type="dxa" w:w="4320"/>
+          </w:tcPr>
+          <w:p>
+            <w:r>
+              <w:t>memuat sesi lama yang tersimpan pada tier 1,7 juta langsung menampilkan banner peringatan dan label sekali-jalan, bukan diam-diam masuk tier berat</w:t>
+            </w:r>
+          </w:p>
+        </w:tc>
+      </w:tr>
+    </w:tbl>
+    <w:p>
+      <w:r>
+        <w:rPr>
+          <w:b w:val="0"/>
+          <w:i w:val="0"/>
+        </w:rPr>
+        <w:t>Selama analisis berjalan, bilah kemajuan menampilkan waktu berjalan dan perkiraan sisa. Perkiraannya kasar dan sengaja tidak pernah menunjukkan "hampir selesai" sebelum benar- benar selesai.</w:t>
+      </w:r>
+    </w:p>
+    <w:p>
+      <w:r>
+        <w:rPr>
+          <w:b w:val="0"/>
+          <w:i w:val="0"/>
+        </w:rPr>
+        <w:t>Waktu nyata di mesin uji (6 inti fisik / 12 utas logis; 4 pemain, cangkul aktif):</w:t>
+      </w:r>
+    </w:p>
+    <w:tbl>
+      <w:tblPr>
+        <w:tblStyle w:val="LightGrid-Accent1"/>
+        <w:tblW w:type="auto" w:w="0"/>
+        <w:tblLook w:firstColumn="1" w:firstRow="1" w:lastColumn="0" w:lastRow="0" w:noHBand="0" w:noVBand="1" w:val="04A0"/>
+      </w:tblPr>
+      <w:tblGrid>
+        <w:gridCol w:w="2880"/>
+        <w:gridCol w:w="2880"/>
+        <w:gridCol w:w="2880"/>
+      </w:tblGrid>
+      <w:tr>
+        <w:tc>
+          <w:tcPr>
+            <w:tcW w:type="dxa" w:w="2880"/>
+          </w:tcPr>
+          <w:p>
+            <w:r>
+              <w:rPr>
+                <w:b/>
+              </w:rPr>
+              <w:t>Situasi</w:t>
+            </w:r>
+          </w:p>
+        </w:tc>
+        <w:tc>
+          <w:tcPr>
+            <w:tcW w:type="dxa" w:w="2880"/>
+          </w:tcPr>
+          <w:p>
+            <w:r>
+              <w:rPr>
+                <w:b/>
+              </w:rPr>
+              <w:t>Kandidat langkah</w:t>
+            </w:r>
+          </w:p>
+        </w:tc>
+        <w:tc>
+          <w:tcPr>
+            <w:tcW w:type="dxa" w:w="2880"/>
+          </w:tcPr>
+          <w:p>
+            <w:r>
+              <w:rPr>
+                <w:b/>
+              </w:rPr>
+              <w:t>Waktu</w:t>
+            </w:r>
+          </w:p>
+        </w:tc>
+      </w:tr>
+      <w:tr>
+        <w:tc>
+          <w:tcPr>
+            <w:tcW w:type="dxa" w:w="2880"/>
+          </w:tcPr>
+          <w:p>
+            <w:r>
+              <w:t>Pertengahan permainan</w:t>
+            </w:r>
+          </w:p>
+        </w:tc>
+        <w:tc>
+          <w:tcPr>
+            <w:tcW w:type="dxa" w:w="2880"/>
+          </w:tcPr>
+          <w:p>
+            <w:r>
+              <w:t>3</w:t>
+            </w:r>
+          </w:p>
+        </w:tc>
+        <w:tc>
+          <w:tcPr>
+            <w:tcW w:type="dxa" w:w="2880"/>
+          </w:tcPr>
+          <w:p>
+            <w:r>
+              <w:t>≈7,5 detik</w:t>
+            </w:r>
+          </w:p>
+        </w:tc>
+      </w:tr>
+      <w:tr>
+        <w:tc>
+          <w:tcPr>
+            <w:tcW w:type="dxa" w:w="2880"/>
+          </w:tcPr>
+          <w:p>
+            <w:r>
+              <w:t>Papan terbuka, banyak pilihan</w:t>
+            </w:r>
+          </w:p>
+        </w:tc>
+        <w:tc>
+          <w:tcPr>
+            <w:tcW w:type="dxa" w:w="2880"/>
+          </w:tcPr>
+          <w:p>
+            <w:r>
+              <w:t>12</w:t>
+            </w:r>
+          </w:p>
+        </w:tc>
+        <w:tc>
+          <w:tcPr>
+            <w:tcW w:type="dxa" w:w="2880"/>
+          </w:tcPr>
+          <w:p>
+            <w:r>
+              <w:t>≈30 detik</w:t>
+            </w:r>
+          </w:p>
+        </w:tc>
+      </w:tr>
+      <w:tr>
+        <w:tc>
+          <w:tcPr>
+            <w:tcW w:type="dxa" w:w="2880"/>
+          </w:tcPr>
+          <w:p>
+            <w:r>
+              <w:t>Mode teliti</w:t>
+            </w:r>
+          </w:p>
+        </w:tc>
+        <w:tc>
+          <w:tcPr>
+            <w:tcW w:type="dxa" w:w="2880"/>
+          </w:tcPr>
+          <w:p>
+            <w:r>
+              <w:t>3</w:t>
+            </w:r>
+          </w:p>
+        </w:tc>
+        <w:tc>
+          <w:tcPr>
+            <w:tcW w:type="dxa" w:w="2880"/>
+          </w:tcPr>
+          <w:p>
+            <w:r>
+              <w:t>≈7,6 detik</w:t>
+            </w:r>
+          </w:p>
+        </w:tc>
+      </w:tr>
+      <w:tr>
+        <w:tc>
+          <w:tcPr>
+            <w:tcW w:type="dxa" w:w="2880"/>
+          </w:tcPr>
+          <w:p>
+            <w:r>
+              <w:t>Papan kosong, seluruh 7 kartu bisa dibuka</w:t>
+            </w:r>
+          </w:p>
+        </w:tc>
+        <w:tc>
+          <w:tcPr>
+            <w:tcW w:type="dxa" w:w="2880"/>
+          </w:tcPr>
+          <w:p>
+            <w:r>
+              <w:t>7</w:t>
+            </w:r>
+          </w:p>
+        </w:tc>
+        <w:tc>
+          <w:tcPr>
+            <w:tcW w:type="dxa" w:w="2880"/>
+          </w:tcPr>
+          <w:p>
+            <w:r>
+              <w:t>22 detik (terukur)</w:t>
+            </w:r>
+          </w:p>
+        </w:tc>
+      </w:tr>
+    </w:tbl>
+    <w:p>
+      <w:r>
+        <w:rPr>
+          <w:b w:val="0"/>
+          <w:i w:val="0"/>
+        </w:rPr>
+        <w:t>Tier ini tetap jauh di bawah batas waktu server (300 detik), jadi hasilnya tidak pernah dipotong di tengah jalan. Yang tidak kalah penting: selagi mesin memakai seluruh 12 utas, antarmuka tetap lancar — diukur 59 frame/detik dan interaksi selesai dalam 18 ms — dan proses mesinnya benar-benar dimatikan dalam ~0,4 detik setelah Anda menekan Batal (diukur ulang oleh uji antarmuka otomatis, lihat Bagian VII).</w:t>
       </w:r>
     </w:p>
     <w:p>
@@ -14860,6 +15457,118 @@
           <w:b/>
           <w:i w:val="0"/>
         </w:rPr>
+        <w:t>Pembatalan yang benar-benar membatalkan.</w:t>
+      </w:r>
+      <w:r>
+        <w:rPr>
+          <w:b w:val="0"/>
+          <w:i w:val="0"/>
+        </w:rPr>
+        <w:t xml:space="preserve"> Peramban yang menekan tombol Batal menutup koneksinya, dan server memantau hal itu setiap 0,2 detik (</w:t>
+      </w:r>
+      <w:r>
+        <w:rPr>
+          <w:rFonts w:ascii="Consolas" w:hAnsi="Consolas"/>
+          <w:b w:val="0"/>
+          <w:i w:val="0"/>
+          <w:sz w:val="19"/>
+        </w:rPr>
+        <w:t>select</w:t>
+      </w:r>
+      <w:r>
+        <w:rPr>
+          <w:b w:val="0"/>
+          <w:i w:val="0"/>
+        </w:rPr>
+        <w:t xml:space="preserve"> + </w:t>
+      </w:r>
+      <w:r>
+        <w:rPr>
+          <w:rFonts w:ascii="Consolas" w:hAnsi="Consolas"/>
+          <w:b w:val="0"/>
+          <w:i w:val="0"/>
+          <w:sz w:val="19"/>
+        </w:rPr>
+        <w:t>MSG_PEEK</w:t>
+      </w:r>
+      <w:r>
+        <w:rPr>
+          <w:b w:val="0"/>
+          <w:i w:val="0"/>
+        </w:rPr>
+        <w:t>). Begitu koneksi hilang, proses mesin dimatikan — penting pada tier 1,7 juta simulasi, karena tanpa ini CPU tetap bekerja penuh (dan antrean ikut terhambat) hanya untuk hasil yang tidak akan pernah ditampilkan.</w:t>
+      </w:r>
+    </w:p>
+    <w:p>
+      <w:r>
+        <w:rPr>
+          <w:b/>
+          <w:i w:val="0"/>
+        </w:rPr>
+        <w:t>Antrean mesin.</w:t>
+      </w:r>
+      <w:r>
+        <w:rPr>
+          <w:b w:val="0"/>
+          <w:i w:val="0"/>
+        </w:rPr>
+        <w:t xml:space="preserve"> Satu proses mesin memakai seluruh inti CPU (</w:t>
+      </w:r>
+      <w:r>
+        <w:rPr>
+          <w:rFonts w:ascii="Consolas" w:hAnsi="Consolas"/>
+          <w:b w:val="0"/>
+          <w:i w:val="0"/>
+          <w:sz w:val="19"/>
+        </w:rPr>
+        <w:t>DOMINO_THREADS</w:t>
+      </w:r>
+      <w:r>
+        <w:rPr>
+          <w:b w:val="0"/>
+          <w:i w:val="0"/>
+        </w:rPr>
+        <w:t xml:space="preserve">). Bila beberapa permintaan datang bersamaan tanpa pengaturan, mereka saling merebut inti yang sama sehingga setiap analisis menjadi lebih lambat dan waktu tunggunya tak terduga. Karena itu server menjalankan mesin bergiliran (bawaan </w:t>
+      </w:r>
+      <w:r>
+        <w:rPr>
+          <w:rFonts w:ascii="Consolas" w:hAnsi="Consolas"/>
+          <w:b w:val="0"/>
+          <w:i w:val="0"/>
+          <w:sz w:val="19"/>
+        </w:rPr>
+        <w:t>DOMINO_MAX_ENGINE=1</w:t>
+      </w:r>
+      <w:r>
+        <w:rPr>
+          <w:b w:val="0"/>
+          <w:i w:val="0"/>
+        </w:rPr>
+        <w:t xml:space="preserve">), dengan antrean berbatas </w:t>
+      </w:r>
+      <w:r>
+        <w:rPr>
+          <w:rFonts w:ascii="Consolas" w:hAnsi="Consolas"/>
+          <w:b w:val="0"/>
+          <w:i w:val="0"/>
+          <w:sz w:val="19"/>
+        </w:rPr>
+        <w:t>DOMINO_ENGINE_WAIT</w:t>
+      </w:r>
+      <w:r>
+        <w:rPr>
+          <w:b w:val="0"/>
+          <w:i w:val="0"/>
+        </w:rPr>
+        <w:t xml:space="preserve"> detik sebelum menjawab 503. Satu permintaan pada satu waktu berarti setiap analisis mendapat kecepatan penuh.</w:t>
+      </w:r>
+    </w:p>
+    <w:p>
+      <w:r>
+        <w:rPr>
+          <w:b/>
+          <w:i w:val="0"/>
+        </w:rPr>
         <w:t>Kode status HTTP yang jujur.</w:t>
       </w:r>
       <w:r>
@@ -15206,6 +15915,38 @@
           <w:p>
             <w:r>
               <w:t>pemasangan belum lengkap</w:t>
+            </w:r>
+          </w:p>
+        </w:tc>
+      </w:tr>
+      <w:tr>
+        <w:tc>
+          <w:tcPr>
+            <w:tcW w:type="dxa" w:w="2880"/>
+          </w:tcPr>
+          <w:p>
+            <w:r>
+              <w:t>antrean mesin penuh (menunggu &gt; DOMINO_ENGINE_WAIT)</w:t>
+            </w:r>
+          </w:p>
+        </w:tc>
+        <w:tc>
+          <w:tcPr>
+            <w:tcW w:type="dxa" w:w="2880"/>
+          </w:tcPr>
+          <w:p>
+            <w:r>
+              <w:t>503</w:t>
+            </w:r>
+          </w:p>
+        </w:tc>
+        <w:tc>
+          <w:tcPr>
+            <w:tcW w:type="dxa" w:w="2880"/>
+          </w:tcPr>
+          <w:p>
+            <w:r>
+              <w:t>semua slot mesin sibuk</w:t>
             </w:r>
           </w:p>
         </w:tc>
@@ -17598,7 +18339,7 @@
         <w:pStyle w:val="Heading2"/>
       </w:pPr>
       <w:r>
-        <w:t>Dua puluh tujuh uji server</w:t>
+        <w:t>Dua puluh sembilan uji server</w:t>
       </w:r>
     </w:p>
     <w:p>
@@ -17802,7 +18543,7 @@
           <w:b/>
           <w:i w:val="0"/>
         </w:rPr>
-        <w:t>Validasi permintaan (6 tes).</w:t>
+        <w:t>Validasi permintaan (8 tes).</w:t>
       </w:r>
       <w:r>
         <w:rPr>
@@ -17857,7 +18598,7 @@
           <w:b w:val="0"/>
           <w:i w:val="0"/>
         </w:rPr>
-        <w:t xml:space="preserve"> (1 sampai 10000, nilai aneh seperti </w:t>
+        <w:t xml:space="preserve"> (1 sampai 1700000, nilai aneh seperti </w:t>
       </w:r>
       <w:r>
         <w:rPr>
@@ -17879,49 +18620,24 @@
     <w:p>
       <w:r>
         <w:rPr>
+          <w:b w:val="0"/>
+          <w:i w:val="0"/>
+        </w:rPr>
+        <w:t xml:space="preserve">Dua tes terakhir kelompok ini menguji </w:t>
+      </w:r>
+      <w:r>
+        <w:rPr>
           <w:b/>
           <w:i w:val="0"/>
         </w:rPr>
-        <w:t>Uji langsung terhadap server (17 tes).</w:t>
-      </w:r>
-      <w:r>
-        <w:rPr>
-          <w:b w:val="0"/>
-          <w:i w:val="0"/>
-        </w:rPr>
-        <w:t xml:space="preserve"> Endpoint kesehatan, </w:t>
-      </w:r>
-      <w:r>
-        <w:rPr>
-          <w:rFonts w:ascii="Consolas" w:hAnsi="Consolas"/>
-          <w:b w:val="0"/>
-          <w:i w:val="0"/>
-          <w:sz w:val="19"/>
-        </w:rPr>
-        <w:t>/api/meta</w:t>
-      </w:r>
-      <w:r>
-        <w:rPr>
-          <w:b w:val="0"/>
-          <w:i w:val="0"/>
-        </w:rPr>
-        <w:t xml:space="preserve"> yang menormalkan masukan dan hanya mengembalikan kartu yang benar-benar ada, analisis end-to-end, mode cangkul mati beserta kartu sisa mati, atribusi </w:t>
-      </w:r>
-      <w:r>
-        <w:rPr>
-          <w:rFonts w:ascii="Consolas" w:hAnsi="Consolas"/>
-          <w:b w:val="0"/>
-          <w:i w:val="0"/>
-          <w:sz w:val="19"/>
-        </w:rPr>
-        <w:t>playedBy</w:t>
-      </w:r>
-      <w:r>
-        <w:rPr>
-          <w:b w:val="0"/>
-          <w:i w:val="0"/>
-        </w:rPr>
-        <w:t>, kasus permainan akhir dengan banyak atribusi, dan kontrak keamanan:</w:t>
+        <w:t>pembatalan</w:t>
+      </w:r>
+      <w:r>
+        <w:rPr>
+          <w:b w:val="0"/>
+          <w:i w:val="0"/>
+        </w:rPr>
+        <w:t>, karena pada tier 1.700.000 tombol Batal bukan sekadar kenyamanan: tanpa itu seluruh inti CPU tetap terpakai puluhan detik.</w:t>
       </w:r>
     </w:p>
     <w:tbl>
@@ -17944,7 +18660,7 @@
               <w:rPr>
                 <w:b/>
               </w:rPr>
-              <w:t>Tes keamanan</w:t>
+              <w:t>Tes</w:t>
             </w:r>
           </w:p>
         </w:tc>
@@ -17969,6 +18685,137 @@
           </w:tcPr>
           <w:p>
             <w:r>
+              <w:t>client_gone_detects_disconnect</w:t>
+            </w:r>
+          </w:p>
+        </w:tc>
+        <w:tc>
+          <w:tcPr>
+            <w:tcW w:type="dxa" w:w="4320"/>
+          </w:tcPr>
+          <w:p>
+            <w:r>
+              <w:t>client_gone benar-benar membedakan koneksi yang masih hidup dari yang sudah ditutup klien, dan tidak memakan data yang masih antre</w:t>
+            </w:r>
+          </w:p>
+        </w:tc>
+      </w:tr>
+      <w:tr>
+        <w:tc>
+          <w:tcPr>
+            <w:tcW w:type="dxa" w:w="4320"/>
+          </w:tcPr>
+          <w:p>
+            <w:r>
+              <w:t>run_engine_cancel_kills_process</w:t>
+            </w:r>
+          </w:p>
+        </w:tc>
+        <w:tc>
+          <w:tcPr>
+            <w:tcW w:type="dxa" w:w="4320"/>
+          </w:tcPr>
+          <w:p>
+            <w:r>
+              <w:t>proses mesin yang sedang menghitung 400.000 simulasi berhenti &lt; 5 detik setelah pembatalan diminta, dan tidak menghasilkan JSON utuh</w:t>
+            </w:r>
+          </w:p>
+        </w:tc>
+      </w:tr>
+    </w:tbl>
+    <w:p>
+      <w:r>
+        <w:rPr>
+          <w:b/>
+          <w:i w:val="0"/>
+        </w:rPr>
+        <w:t>Uji langsung terhadap server (17 tes).</w:t>
+      </w:r>
+      <w:r>
+        <w:rPr>
+          <w:b w:val="0"/>
+          <w:i w:val="0"/>
+        </w:rPr>
+        <w:t xml:space="preserve"> Endpoint kesehatan, </w:t>
+      </w:r>
+      <w:r>
+        <w:rPr>
+          <w:rFonts w:ascii="Consolas" w:hAnsi="Consolas"/>
+          <w:b w:val="0"/>
+          <w:i w:val="0"/>
+          <w:sz w:val="19"/>
+        </w:rPr>
+        <w:t>/api/meta</w:t>
+      </w:r>
+      <w:r>
+        <w:rPr>
+          <w:b w:val="0"/>
+          <w:i w:val="0"/>
+        </w:rPr>
+        <w:t xml:space="preserve"> yang menormalkan masukan dan hanya mengembalikan kartu yang benar-benar ada, analisis end-to-end, mode cangkul mati beserta kartu sisa mati, atribusi </w:t>
+      </w:r>
+      <w:r>
+        <w:rPr>
+          <w:rFonts w:ascii="Consolas" w:hAnsi="Consolas"/>
+          <w:b w:val="0"/>
+          <w:i w:val="0"/>
+          <w:sz w:val="19"/>
+        </w:rPr>
+        <w:t>playedBy</w:t>
+      </w:r>
+      <w:r>
+        <w:rPr>
+          <w:b w:val="0"/>
+          <w:i w:val="0"/>
+        </w:rPr>
+        <w:t>, kasus permainan akhir dengan banyak atribusi, dan kontrak keamanan:</w:t>
+      </w:r>
+    </w:p>
+    <w:tbl>
+      <w:tblPr>
+        <w:tblStyle w:val="LightGrid-Accent1"/>
+        <w:tblW w:type="auto" w:w="0"/>
+        <w:tblLook w:firstColumn="1" w:firstRow="1" w:lastColumn="0" w:lastRow="0" w:noHBand="0" w:noVBand="1" w:val="04A0"/>
+      </w:tblPr>
+      <w:tblGrid>
+        <w:gridCol w:w="4320"/>
+        <w:gridCol w:w="4320"/>
+      </w:tblGrid>
+      <w:tr>
+        <w:tc>
+          <w:tcPr>
+            <w:tcW w:type="dxa" w:w="4320"/>
+          </w:tcPr>
+          <w:p>
+            <w:r>
+              <w:rPr>
+                <w:b/>
+              </w:rPr>
+              <w:t>Tes keamanan</w:t>
+            </w:r>
+          </w:p>
+        </w:tc>
+        <w:tc>
+          <w:tcPr>
+            <w:tcW w:type="dxa" w:w="4320"/>
+          </w:tcPr>
+          <w:p>
+            <w:r>
+              <w:rPr>
+                <w:b/>
+              </w:rPr>
+              <w:t>Yang dibuktikan</w:t>
+            </w:r>
+          </w:p>
+        </w:tc>
+      </w:tr>
+      <w:tr>
+        <w:tc>
+          <w:tcPr>
+            <w:tcW w:type="dxa" w:w="4320"/>
+          </w:tcPr>
+          <w:p>
+            <w:r>
               <w:t>security_headers_present</w:t>
             </w:r>
           </w:p>
@@ -18224,7 +19071,7 @@
           <w:rFonts w:ascii="Consolas" w:hAnsi="Consolas"/>
           <w:sz w:val="17"/>
         </w:rPr>
-        <w:t>Ran 27 tests in 0.781s</w:t>
+        <w:t>Ran 29 tests in 1.093s</w:t>
         <w:br/>
         <w:t>OK</w:t>
       </w:r>
@@ -18234,16 +19081,16 @@
         <w:pStyle w:val="Heading2"/>
       </w:pPr>
       <w:r>
-        <w:t>Integrasi berkelanjutan (CI)</w:t>
-      </w:r>
-    </w:p>
-    <w:p>
-      <w:r>
-        <w:rPr>
-          <w:b w:val="0"/>
-          <w:i w:val="0"/>
-        </w:rPr>
-        <w:t xml:space="preserve">Setiap kali perubahan dikirim ke cabang </w:t>
+        <w:t>Paralelisasi: output harus tidak berubah (4 tes)</w:t>
+      </w:r>
+    </w:p>
+    <w:p>
+      <w:r>
+        <w:rPr>
+          <w:b w:val="0"/>
+          <w:i w:val="0"/>
+        </w:rPr>
+        <w:t>Mesin menjalankan simulasi Monte-Carlo dengan beberapa thread sekaligus (</w:t>
       </w:r>
       <w:r>
         <w:rPr>
@@ -18252,14 +19099,817 @@
           <w:i w:val="0"/>
           <w:sz w:val="19"/>
         </w:rPr>
-        <w:t>main</w:t>
-      </w:r>
-      <w:r>
-        <w:rPr>
-          <w:b w:val="0"/>
-          <w:i w:val="0"/>
-        </w:rPr>
-        <w:t>, tiga pekerjaan berjalan di GitHub Actions:</w:t>
+        <w:t>DOMINO_THREADS</w:t>
+      </w:r>
+      <w:r>
+        <w:rPr>
+          <w:b w:val="0"/>
+          <w:i w:val="0"/>
+        </w:rPr>
+        <w:t>, bawaan semua inti logis). Satu hal yang tidak boleh terjadi adalah jumlah thread mengubah hasil: pembagian blok kerja memakai snapshot stream bilangan acak yang sama, sehingga urutan undian tiap simulasi tetap identik.</w:t>
+      </w:r>
+    </w:p>
+    <w:p>
+      <w:r>
+        <w:rPr>
+          <w:b w:val="0"/>
+          <w:i w:val="0"/>
+        </w:rPr>
+        <w:t xml:space="preserve">Jalankan </w:t>
+      </w:r>
+      <w:r>
+        <w:rPr>
+          <w:rFonts w:ascii="Consolas" w:hAnsi="Consolas"/>
+          <w:b w:val="0"/>
+          <w:i w:val="0"/>
+          <w:sz w:val="19"/>
+        </w:rPr>
+        <w:t>python tools/test_engine_parallel.py</w:t>
+      </w:r>
+      <w:r>
+        <w:rPr>
+          <w:b w:val="0"/>
+          <w:i w:val="0"/>
+        </w:rPr>
+        <w:t>:</w:t>
+      </w:r>
+    </w:p>
+    <w:tbl>
+      <w:tblPr>
+        <w:tblStyle w:val="LightGrid-Accent1"/>
+        <w:tblW w:type="auto" w:w="0"/>
+        <w:tblLook w:firstColumn="1" w:firstRow="1" w:lastColumn="0" w:lastRow="0" w:noHBand="0" w:noVBand="1" w:val="04A0"/>
+      </w:tblPr>
+      <w:tblGrid>
+        <w:gridCol w:w="4320"/>
+        <w:gridCol w:w="4320"/>
+      </w:tblGrid>
+      <w:tr>
+        <w:tc>
+          <w:tcPr>
+            <w:tcW w:type="dxa" w:w="4320"/>
+          </w:tcPr>
+          <w:p>
+            <w:r>
+              <w:rPr>
+                <w:b/>
+              </w:rPr>
+              <w:t>Tes</w:t>
+            </w:r>
+          </w:p>
+        </w:tc>
+        <w:tc>
+          <w:tcPr>
+            <w:tcW w:type="dxa" w:w="4320"/>
+          </w:tcPr>
+          <w:p>
+            <w:r>
+              <w:rPr>
+                <w:b/>
+              </w:rPr>
+              <w:t>Yang dibuktikan</w:t>
+            </w:r>
+          </w:p>
+        </w:tc>
+      </w:tr>
+      <w:tr>
+        <w:tc>
+          <w:tcPr>
+            <w:tcW w:type="dxa" w:w="4320"/>
+          </w:tcPr>
+          <w:p>
+            <w:r>
+              <w:t>parallel_equals_sequential</w:t>
+            </w:r>
+          </w:p>
+        </w:tc>
+        <w:tc>
+          <w:tcPr>
+            <w:tcW w:type="dxa" w:w="4320"/>
+          </w:tcPr>
+          <w:p>
+            <w:r>
+              <w:t>output 1 thread sama persis dengan 2 dan 8 thread pada empat skenario (4 pemain, adversarial, 2 pemain, batas 2000 sim)</w:t>
+            </w:r>
+          </w:p>
+        </w:tc>
+      </w:tr>
+      <w:tr>
+        <w:tc>
+          <w:tcPr>
+            <w:tcW w:type="dxa" w:w="4320"/>
+          </w:tcPr>
+          <w:p>
+            <w:r>
+              <w:t>default_threads_matches_sequential</w:t>
+            </w:r>
+          </w:p>
+        </w:tc>
+        <w:tc>
+          <w:tcPr>
+            <w:tcW w:type="dxa" w:w="4320"/>
+          </w:tcPr>
+          <w:p>
+            <w:r>
+              <w:t>mode bawaan (semua inti) sama dengan mode sekuensial</w:t>
+            </w:r>
+          </w:p>
+        </w:tc>
+      </w:tr>
+      <w:tr>
+        <w:tc>
+          <w:tcPr>
+            <w:tcW w:type="dxa" w:w="4320"/>
+          </w:tcPr>
+          <w:p>
+            <w:r>
+              <w:t>threads_zero_or_negative_means_sequential</w:t>
+            </w:r>
+          </w:p>
+        </w:tc>
+        <w:tc>
+          <w:tcPr>
+            <w:tcW w:type="dxa" w:w="4320"/>
+          </w:tcPr>
+          <w:p>
+            <w:r>
+              <w:t>DOMINO_THREADS=0 dan angka negatif tidak membuat mesin gagal, dan tetap sekuensial</w:t>
+            </w:r>
+          </w:p>
+        </w:tc>
+      </w:tr>
+      <w:tr>
+        <w:tc>
+          <w:tcPr>
+            <w:tcW w:type="dxa" w:w="4320"/>
+          </w:tcPr>
+          <w:p>
+            <w:r>
+              <w:t>empty_unknown_pool_does_not_crash</w:t>
+            </w:r>
+          </w:p>
+        </w:tc>
+        <w:tc>
+          <w:tcPr>
+            <w:tcW w:type="dxa" w:w="4320"/>
+          </w:tcPr>
+          <w:p>
+            <w:r>
+              <w:t>permintaan dengan pool kartu tak diketahui kosong (2 pemain x 14 kartu) tidak lagi mematikan proses</w:t>
+            </w:r>
+          </w:p>
+        </w:tc>
+      </w:tr>
+    </w:tbl>
+    <w:p>
+      <w:r>
+        <w:rPr>
+          <w:b w:val="0"/>
+          <w:i w:val="0"/>
+        </w:rPr>
+        <w:t xml:space="preserve">Ditambah suite beban penuh (dijalankan dengan </w:t>
+      </w:r>
+      <w:r>
+        <w:rPr>
+          <w:rFonts w:ascii="Consolas" w:hAnsi="Consolas"/>
+          <w:b w:val="0"/>
+          <w:i w:val="0"/>
+          <w:sz w:val="19"/>
+        </w:rPr>
+        <w:t>DOMINO_SLOW_TESTS=1</w:t>
+      </w:r>
+      <w:r>
+        <w:rPr>
+          <w:b w:val="0"/>
+          <w:i w:val="0"/>
+        </w:rPr>
+        <w:t>, ≈1 menit) untuk tier 1.700.000 simulasi — beban maksimum yang ditawarkan aplikasi:</w:t>
+      </w:r>
+    </w:p>
+    <w:tbl>
+      <w:tblPr>
+        <w:tblStyle w:val="LightGrid-Accent1"/>
+        <w:tblW w:type="auto" w:w="0"/>
+        <w:tblLook w:firstColumn="1" w:firstRow="1" w:lastColumn="0" w:lastRow="0" w:noHBand="0" w:noVBand="1" w:val="04A0"/>
+      </w:tblPr>
+      <w:tblGrid>
+        <w:gridCol w:w="4320"/>
+        <w:gridCol w:w="4320"/>
+      </w:tblGrid>
+      <w:tr>
+        <w:tc>
+          <w:tcPr>
+            <w:tcW w:type="dxa" w:w="4320"/>
+          </w:tcPr>
+          <w:p>
+            <w:r>
+              <w:rPr>
+                <w:b/>
+              </w:rPr>
+              <w:t>Tes</w:t>
+            </w:r>
+          </w:p>
+        </w:tc>
+        <w:tc>
+          <w:tcPr>
+            <w:tcW w:type="dxa" w:w="4320"/>
+          </w:tcPr>
+          <w:p>
+            <w:r>
+              <w:rPr>
+                <w:b/>
+              </w:rPr>
+              <w:t>Yang dibuktikan</w:t>
+            </w:r>
+          </w:p>
+        </w:tc>
+      </w:tr>
+      <w:tr>
+        <w:tc>
+          <w:tcPr>
+            <w:tcW w:type="dxa" w:w="4320"/>
+          </w:tcPr>
+          <w:p>
+            <w:r>
+              <w:t>test_no_crash_and_ok</w:t>
+            </w:r>
+          </w:p>
+        </w:tc>
+        <w:tc>
+          <w:tcPr>
+            <w:tcW w:type="dxa" w:w="4320"/>
+          </w:tcPr>
+          <w:p>
+            <w:r>
+              <w:t>mesin tidak jatuh dan tidak memangkas numSims pada beban penuh</w:t>
+            </w:r>
+          </w:p>
+        </w:tc>
+      </w:tr>
+      <w:tr>
+        <w:tc>
+          <w:tcPr>
+            <w:tcW w:type="dxa" w:w="4320"/>
+          </w:tcPr>
+          <w:p>
+            <w:r>
+              <w:t>test_counts_and_conservation_at_full_load</w:t>
+            </w:r>
+          </w:p>
+        </w:tc>
+        <w:tc>
+          <w:tcPr>
+            <w:tcW w:type="dxa" w:w="4320"/>
+          </w:tcPr>
+          <w:p>
+            <w:r>
+              <w:t>wins + losses == numSims, rincian kemenangan konsisten, konservasi kartu terjaga, dan lebar interval &lt; 0,2 poin (janji ±0,1%)</w:t>
+            </w:r>
+          </w:p>
+        </w:tc>
+      </w:tr>
+      <w:tr>
+        <w:tc>
+          <w:tcPr>
+            <w:tcW w:type="dxa" w:w="4320"/>
+          </w:tcPr>
+          <w:p>
+            <w:r>
+              <w:t>test_rankScore_sorted</w:t>
+            </w:r>
+          </w:p>
+        </w:tc>
+        <w:tc>
+          <w:tcPr>
+            <w:tcW w:type="dxa" w:w="4320"/>
+          </w:tcPr>
+          <w:p>
+            <w:r>
+              <w:t>urutan peringkat tetap benar pada beban penuh</w:t>
+            </w:r>
+          </w:p>
+        </w:tc>
+      </w:tr>
+      <w:tr>
+        <w:tc>
+          <w:tcPr>
+            <w:tcW w:type="dxa" w:w="4320"/>
+          </w:tcPr>
+          <w:p>
+            <w:r>
+              <w:t>test_full_load_parallel_equals_sequential</w:t>
+            </w:r>
+          </w:p>
+        </w:tc>
+        <w:tc>
+          <w:tcPr>
+            <w:tcW w:type="dxa" w:w="4320"/>
+          </w:tcPr>
+          <w:p>
+            <w:r>
+              <w:t>output 1 thread, 4 thread, dan 12 thread sama persis pada 1,7 juta simulasi</w:t>
+            </w:r>
+          </w:p>
+        </w:tc>
+      </w:tr>
+    </w:tbl>
+    <w:p>
+      <w:r>
+        <w:rPr>
+          <w:b w:val="0"/>
+          <w:i w:val="0"/>
+        </w:rPr>
+        <w:t xml:space="preserve">Hanya dua jalur pembatalan yang diuji di suite ini (level soket): pembatalan yang benar saat pengguna menekan Batal juga sudah diverifikasi dari sisi antarmuka (lihat akhir bab ini). Bukti nyata dari jalur browser: log server mencatat </w:t>
+      </w:r>
+      <w:r>
+        <w:rPr>
+          <w:rFonts w:ascii="Consolas" w:hAnsi="Consolas"/>
+          <w:b w:val="0"/>
+          <w:i w:val="0"/>
+          <w:sz w:val="19"/>
+        </w:rPr>
+        <w:t>[engine] dibatalkan: klien menutup koneksi</w:t>
+      </w:r>
+      <w:r>
+        <w:rPr>
+          <w:b w:val="0"/>
+          <w:i w:val="0"/>
+        </w:rPr>
+        <w:t xml:space="preserve">, dan tidak ada satu pun proses </w:t>
+      </w:r>
+      <w:r>
+        <w:rPr>
+          <w:rFonts w:ascii="Consolas" w:hAnsi="Consolas"/>
+          <w:b w:val="0"/>
+          <w:i w:val="0"/>
+          <w:sz w:val="19"/>
+        </w:rPr>
+        <w:t>domino_engine</w:t>
+      </w:r>
+      <w:r>
+        <w:rPr>
+          <w:b w:val="0"/>
+          <w:i w:val="0"/>
+        </w:rPr>
+        <w:t xml:space="preserve"> yang tertinggal.</w:t>
+      </w:r>
+    </w:p>
+    <w:p>
+      <w:r>
+        <w:rPr>
+          <w:b w:val="0"/>
+          <w:i w:val="0"/>
+        </w:rPr>
+        <w:t xml:space="preserve">Dua tes terakhir adalah pengaman regresi untuk cacat nyata: </w:t>
+      </w:r>
+      <w:r>
+        <w:rPr>
+          <w:rFonts w:ascii="Consolas" w:hAnsi="Consolas"/>
+          <w:b w:val="0"/>
+          <w:i w:val="0"/>
+          <w:sz w:val="19"/>
+        </w:rPr>
+        <w:t>shuffle</w:t>
+      </w:r>
+      <w:r>
+        <w:rPr>
+          <w:b w:val="0"/>
+          <w:i w:val="0"/>
+        </w:rPr>
+        <w:t xml:space="preserve"> pada vector kosong dulu memakai indeks </w:t>
+      </w:r>
+      <w:r>
+        <w:rPr>
+          <w:rFonts w:ascii="Consolas" w:hAnsi="Consolas"/>
+          <w:b w:val="0"/>
+          <w:i w:val="0"/>
+          <w:sz w:val="19"/>
+        </w:rPr>
+        <w:t>SIZE_MAX</w:t>
+      </w:r>
+      <w:r>
+        <w:rPr>
+          <w:b w:val="0"/>
+          <w:i w:val="0"/>
+        </w:rPr>
+        <w:t xml:space="preserve"> lalu </w:t>
+      </w:r>
+      <w:r>
+        <w:rPr>
+          <w:rFonts w:ascii="Consolas" w:hAnsi="Consolas"/>
+          <w:b w:val="0"/>
+          <w:i w:val="0"/>
+          <w:sz w:val="19"/>
+        </w:rPr>
+        <w:t>nextInt(0)</w:t>
+      </w:r>
+      <w:r>
+        <w:rPr>
+          <w:b w:val="0"/>
+          <w:i w:val="0"/>
+        </w:rPr>
+        <w:t xml:space="preserve"> (modulo nol) — proses mati dengan </w:t>
+      </w:r>
+      <w:r>
+        <w:rPr>
+          <w:rFonts w:ascii="Consolas" w:hAnsi="Consolas"/>
+          <w:b w:val="0"/>
+          <w:i w:val="0"/>
+          <w:sz w:val="19"/>
+        </w:rPr>
+        <w:t>0xC0000094</w:t>
+      </w:r>
+      <w:r>
+        <w:rPr>
+          <w:b w:val="0"/>
+          <w:i w:val="0"/>
+        </w:rPr>
+        <w:t>/</w:t>
+      </w:r>
+      <w:r>
+        <w:rPr>
+          <w:rFonts w:ascii="Consolas" w:hAnsi="Consolas"/>
+          <w:b w:val="0"/>
+          <w:i w:val="0"/>
+          <w:sz w:val="19"/>
+        </w:rPr>
+        <w:t>0xC0000005</w:t>
+      </w:r>
+      <w:r>
+        <w:rPr>
+          <w:b w:val="0"/>
+          <w:i w:val="0"/>
+        </w:rPr>
+        <w:t>.</w:t>
+      </w:r>
+    </w:p>
+    <w:p>
+      <w:pPr>
+        <w:pStyle w:val="Heading2"/>
+      </w:pPr>
+      <w:r>
+        <w:t>Verifikasi identik terhadap build sebelumnya</w:t>
+      </w:r>
+    </w:p>
+    <w:p>
+      <w:r>
+        <w:rPr>
+          <w:b w:val="0"/>
+          <w:i w:val="0"/>
+        </w:rPr>
+        <w:t xml:space="preserve">Perubahan pada jalur perhitungan tidak boleh dinilai hanya dari "masih jalan". </w:t>
+      </w:r>
+      <w:r>
+        <w:rPr>
+          <w:rFonts w:ascii="Consolas" w:hAnsi="Consolas"/>
+          <w:b w:val="0"/>
+          <w:i w:val="0"/>
+          <w:sz w:val="19"/>
+        </w:rPr>
+        <w:t>tools/audit_golden.py</w:t>
+      </w:r>
+      <w:r>
+        <w:rPr>
+          <w:b w:val="0"/>
+          <w:i w:val="0"/>
+        </w:rPr>
+        <w:t xml:space="preserve"> membandingkan keluaran mesin </w:t>
+      </w:r>
+      <w:r>
+        <w:rPr>
+          <w:b/>
+          <w:i w:val="0"/>
+        </w:rPr>
+        <w:t>byte-per-byte</w:t>
+      </w:r>
+      <w:r>
+        <w:rPr>
+          <w:b w:val="0"/>
+          <w:i w:val="0"/>
+        </w:rPr>
+        <w:t>:</w:t>
+      </w:r>
+    </w:p>
+    <w:p>
+      <w:pPr>
+        <w:ind w:left="240"/>
+      </w:pPr>
+      <w:r>
+        <w:rPr>
+          <w:rFonts w:ascii="Consolas" w:hAnsi="Consolas"/>
+          <w:sz w:val="17"/>
+        </w:rPr>
+        <w:t>python tools/build_baseline.py                       # bangun mesin dari git HEAD + rekam golden</w:t>
+        <w:br/>
+        <w:t>python tools/audit_golden.py verify "$TEMP/domino_audit_head"</w:t>
+      </w:r>
+    </w:p>
+    <w:p>
+      <w:r>
+        <w:rPr>
+          <w:b w:val="0"/>
+          <w:i w:val="0"/>
+        </w:rPr>
+        <w:t xml:space="preserve">Sembilan skenario diuji: 2/3/4 pemain, mode adversarial, cangkul mati, kartu pertama, atribusi </w:t>
+      </w:r>
+      <w:r>
+        <w:rPr>
+          <w:rFonts w:ascii="Consolas" w:hAnsi="Consolas"/>
+          <w:b w:val="0"/>
+          <w:i w:val="0"/>
+          <w:sz w:val="19"/>
+        </w:rPr>
+        <w:t>playedBy</w:t>
+      </w:r>
+      <w:r>
+        <w:rPr>
+          <w:b w:val="0"/>
+          <w:i w:val="0"/>
+        </w:rPr>
+        <w:t xml:space="preserve">, 5000 simulasi (jalur paralel), batas 2000 simulasi, dan pool kartu kosong. Semuanya harus melaporkan </w:t>
+      </w:r>
+      <w:r>
+        <w:rPr>
+          <w:rFonts w:ascii="Consolas" w:hAnsi="Consolas"/>
+          <w:b w:val="0"/>
+          <w:i w:val="0"/>
+          <w:sz w:val="19"/>
+        </w:rPr>
+        <w:t>IDENTIK</w:t>
+      </w:r>
+      <w:r>
+        <w:rPr>
+          <w:b w:val="0"/>
+          <w:i w:val="0"/>
+        </w:rPr>
+        <w:t xml:space="preserve">. Skrip mencatat juga bila mesin lama </w:t>
+      </w:r>
+      <w:r>
+        <w:rPr>
+          <w:b/>
+          <w:i w:val="0"/>
+        </w:rPr>
+        <w:t>crash</w:t>
+      </w:r>
+      <w:r>
+        <w:rPr>
+          <w:b w:val="0"/>
+          <w:i w:val="0"/>
+        </w:rPr>
+        <w:t xml:space="preserve"> pada suatu skenario, lalu memeriksa bahwa crash itu sudah hilang.</w:t>
+      </w:r>
+    </w:p>
+    <w:p>
+      <w:pPr>
+        <w:pStyle w:val="Heading2"/>
+      </w:pPr>
+      <w:r>
+        <w:t>Mengukur kecepatan</w:t>
+      </w:r>
+    </w:p>
+    <w:p>
+      <w:pPr>
+        <w:ind w:left="240"/>
+      </w:pPr>
+      <w:r>
+        <w:rPr>
+          <w:rFonts w:ascii="Consolas" w:hAnsi="Consolas"/>
+          <w:sz w:val="17"/>
+        </w:rPr>
+        <w:t>python tools/bench_engine.py     # mesin HEAD vs optimasi 1 thread vs optimasi paralel</w:t>
+      </w:r>
+    </w:p>
+    <w:p>
+      <w:r>
+        <w:rPr>
+          <w:b w:val="0"/>
+          <w:i w:val="0"/>
+        </w:rPr>
+        <w:t xml:space="preserve">Contoh keluaran di mesin uji pada beban 50.000 simulasi x jumlah kandidat langkah (AMD Ryzen 5 5625U — </w:t>
+      </w:r>
+      <w:r>
+        <w:rPr>
+          <w:b/>
+          <w:i w:val="0"/>
+        </w:rPr>
+        <w:t>6 inti fisik / 12 utas logis</w:t>
+      </w:r>
+      <w:r>
+        <w:rPr>
+          <w:b w:val="0"/>
+          <w:i w:val="0"/>
+        </w:rPr>
+        <w:t>; "12 thread" di bawah berarti 12 utas):</w:t>
+      </w:r>
+    </w:p>
+    <w:tbl>
+      <w:tblPr>
+        <w:tblStyle w:val="LightGrid-Accent1"/>
+        <w:tblW w:type="auto" w:w="0"/>
+        <w:tblLook w:firstColumn="1" w:firstRow="1" w:lastColumn="0" w:lastRow="0" w:noHBand="0" w:noVBand="1" w:val="04A0"/>
+      </w:tblPr>
+      <w:tblGrid>
+        <w:gridCol w:w="2160"/>
+        <w:gridCol w:w="2160"/>
+        <w:gridCol w:w="2160"/>
+        <w:gridCol w:w="2160"/>
+      </w:tblGrid>
+      <w:tr>
+        <w:tc>
+          <w:tcPr>
+            <w:tcW w:type="dxa" w:w="2160"/>
+          </w:tcPr>
+          <w:p>
+            <w:r>
+              <w:rPr>
+                <w:b/>
+              </w:rPr>
+              <w:t>Versi</w:t>
+            </w:r>
+          </w:p>
+        </w:tc>
+        <w:tc>
+          <w:tcPr>
+            <w:tcW w:type="dxa" w:w="2160"/>
+          </w:tcPr>
+          <w:p>
+            <w:r>
+              <w:rPr>
+                <w:b/>
+              </w:rPr>
+              <w:t>Waktu</w:t>
+            </w:r>
+          </w:p>
+        </w:tc>
+        <w:tc>
+          <w:tcPr>
+            <w:tcW w:type="dxa" w:w="2160"/>
+          </w:tcPr>
+          <w:p>
+            <w:r>
+              <w:rPr>
+                <w:b/>
+              </w:rPr>
+              <w:t>Laju</w:t>
+            </w:r>
+          </w:p>
+        </w:tc>
+        <w:tc>
+          <w:tcPr>
+            <w:tcW w:type="dxa" w:w="2160"/>
+          </w:tcPr>
+          <w:p>
+            <w:r>
+              <w:rPr>
+                <w:b/>
+              </w:rPr>
+              <w:t>Relatif</w:t>
+            </w:r>
+          </w:p>
+        </w:tc>
+      </w:tr>
+      <w:tr>
+        <w:tc>
+          <w:tcPr>
+            <w:tcW w:type="dxa" w:w="2160"/>
+          </w:tcPr>
+          <w:p>
+            <w:r>
+              <w:t>build HEAD</w:t>
+            </w:r>
+          </w:p>
+        </w:tc>
+        <w:tc>
+          <w:tcPr>
+            <w:tcW w:type="dxa" w:w="2160"/>
+          </w:tcPr>
+          <w:p>
+            <w:r>
+              <w:t>2,62 s</w:t>
+            </w:r>
+          </w:p>
+        </w:tc>
+        <w:tc>
+          <w:tcPr>
+            <w:tcW w:type="dxa" w:w="2160"/>
+          </w:tcPr>
+          <w:p>
+            <w:r>
+              <w:t>57.344 sim/detik</w:t>
+            </w:r>
+          </w:p>
+        </w:tc>
+        <w:tc>
+          <w:tcPr>
+            <w:tcW w:type="dxa" w:w="2160"/>
+          </w:tcPr>
+          <w:p>
+            <w:r>
+              <w:t>1,00x</w:t>
+            </w:r>
+          </w:p>
+        </w:tc>
+      </w:tr>
+      <w:tr>
+        <w:tc>
+          <w:tcPr>
+            <w:tcW w:type="dxa" w:w="2160"/>
+          </w:tcPr>
+          <w:p>
+            <w:r>
+              <w:t>optimasi 1 thread</w:t>
+            </w:r>
+          </w:p>
+        </w:tc>
+        <w:tc>
+          <w:tcPr>
+            <w:tcW w:type="dxa" w:w="2160"/>
+          </w:tcPr>
+          <w:p>
+            <w:r>
+              <w:t>1,03 s</w:t>
+            </w:r>
+          </w:p>
+        </w:tc>
+        <w:tc>
+          <w:tcPr>
+            <w:tcW w:type="dxa" w:w="2160"/>
+          </w:tcPr>
+          <w:p>
+            <w:r>
+              <w:t>146.042 sim/detik</w:t>
+            </w:r>
+          </w:p>
+        </w:tc>
+        <w:tc>
+          <w:tcPr>
+            <w:tcW w:type="dxa" w:w="2160"/>
+          </w:tcPr>
+          <w:p>
+            <w:r>
+              <w:t>2,55x</w:t>
+            </w:r>
+          </w:p>
+        </w:tc>
+      </w:tr>
+      <w:tr>
+        <w:tc>
+          <w:tcPr>
+            <w:tcW w:type="dxa" w:w="2160"/>
+          </w:tcPr>
+          <w:p>
+            <w:r>
+              <w:t>optimasi paralel (12 thread)</w:t>
+            </w:r>
+          </w:p>
+        </w:tc>
+        <w:tc>
+          <w:tcPr>
+            <w:tcW w:type="dxa" w:w="2160"/>
+          </w:tcPr>
+          <w:p>
+            <w:r>
+              <w:t>0,20 s</w:t>
+            </w:r>
+          </w:p>
+        </w:tc>
+        <w:tc>
+          <w:tcPr>
+            <w:tcW w:type="dxa" w:w="2160"/>
+          </w:tcPr>
+          <w:p>
+            <w:r>
+              <w:t>770.762 sim/detik</w:t>
+            </w:r>
+          </w:p>
+        </w:tc>
+        <w:tc>
+          <w:tcPr>
+            <w:tcW w:type="dxa" w:w="2160"/>
+          </w:tcPr>
+          <w:p>
+            <w:r>
+              <w:t>13,44x</w:t>
+            </w:r>
+          </w:p>
+        </w:tc>
+      </w:tr>
+    </w:tbl>
+    <w:p>
+      <w:pPr>
+        <w:pStyle w:val="Heading3"/>
+      </w:pPr>
+      <w:r>
+        <w:t>Beban penuh (tier 1.700.000) yang terukur</w:t>
+      </w:r>
+    </w:p>
+    <w:p>
+      <w:r>
+        <w:rPr>
+          <w:b w:val="0"/>
+          <w:i w:val="0"/>
+        </w:rPr>
+        <w:t>Tier tertinggi bukan sekadar angka di dokumen; ia diukur, dan invariannya diperiksa pada skala itu. Semua angka di bawah berasal dari mesin uji di atas, 4 pemain, cangkul aktif, 7 kandidat langkah (papan kosong, 7 kartu di tangan):</w:t>
       </w:r>
     </w:p>
     <w:tbl>
@@ -18283,6 +19933,901 @@
               <w:rPr>
                 <w:b/>
               </w:rPr>
+              <w:t>Yang diukur</w:t>
+            </w:r>
+          </w:p>
+        </w:tc>
+        <w:tc>
+          <w:tcPr>
+            <w:tcW w:type="dxa" w:w="2880"/>
+          </w:tcPr>
+          <w:p>
+            <w:r>
+              <w:rPr>
+                <w:b/>
+              </w:rPr>
+              <w:t>Hasil</w:t>
+            </w:r>
+          </w:p>
+        </w:tc>
+        <w:tc>
+          <w:tcPr>
+            <w:tcW w:type="dxa" w:w="2880"/>
+          </w:tcPr>
+          <w:p>
+            <w:r>
+              <w:rPr>
+                <w:b/>
+              </w:rPr>
+              <w:t>Arti</w:t>
+            </w:r>
+          </w:p>
+        </w:tc>
+      </w:tr>
+      <w:tr>
+        <w:tc>
+          <w:tcPr>
+            <w:tcW w:type="dxa" w:w="2880"/>
+          </w:tcPr>
+          <w:p>
+            <w:r>
+              <w:t>Waktu satu analisis penuh</w:t>
+            </w:r>
+          </w:p>
+        </w:tc>
+        <w:tc>
+          <w:tcPr>
+            <w:tcW w:type="dxa" w:w="2880"/>
+          </w:tcPr>
+          <w:p>
+            <w:r>
+              <w:t>22,0 s (11,9 juta simulasi-langkah)</w:t>
+            </w:r>
+          </w:p>
+        </w:tc>
+        <w:tc>
+          <w:tcPr>
+            <w:tcW w:type="dxa" w:w="2880"/>
+          </w:tcPr>
+          <w:p>
+            <w:r>
+              <w:t>jauh di bawah batas 300 detik, jadi tidak ada hasil yang terpotong</w:t>
+            </w:r>
+          </w:p>
+        </w:tc>
+      </w:tr>
+      <w:tr>
+        <w:tc>
+          <w:tcPr>
+            <w:tcW w:type="dxa" w:w="2880"/>
+          </w:tcPr>
+          <w:p>
+            <w:r>
+              <w:t>Laju</w:t>
+            </w:r>
+          </w:p>
+        </w:tc>
+        <w:tc>
+          <w:tcPr>
+            <w:tcW w:type="dxa" w:w="2880"/>
+          </w:tcPr>
+          <w:p>
+            <w:r>
+              <w:t>602.081 simulasi-langkah/detik (12 utas)</w:t>
+            </w:r>
+          </w:p>
+        </w:tc>
+        <w:tc>
+          <w:tcPr>
+            <w:tcW w:type="dxa" w:w="2880"/>
+          </w:tcPr>
+          <w:p>
+            <w:r>
+              <w:t>"1,7 juta simulasi" per kartu selesai dalam ~3 detik</w:t>
+            </w:r>
+          </w:p>
+        </w:tc>
+      </w:tr>
+      <w:tr>
+        <w:tc>
+          <w:tcPr>
+            <w:tcW w:type="dxa" w:w="2880"/>
+          </w:tcPr>
+          <w:p>
+            <w:r>
+              <w:t>Efisiensi paralel</w:t>
+            </w:r>
+          </w:p>
+        </w:tc>
+        <w:tc>
+          <w:tcPr>
+            <w:tcW w:type="dxa" w:w="2880"/>
+          </w:tcPr>
+          <w:p>
+            <w:r>
+              <w:t>5,23x pada 12 utas = 87,2% dari 6 inti fisik (6 utas memberi 3,79x)</w:t>
+            </w:r>
+          </w:p>
+        </w:tc>
+        <w:tc>
+          <w:tcPr>
+            <w:tcW w:type="dxa" w:w="2880"/>
+          </w:tcPr>
+          <w:p>
+            <w:r>
+              <w:t>sisa ~13% adalah bagian yang memang sekuensial (perakitan hasil, simulasi sisa kartu)</w:t>
+            </w:r>
+          </w:p>
+        </w:tc>
+      </w:tr>
+      <w:tr>
+        <w:tc>
+          <w:tcPr>
+            <w:tcW w:type="dxa" w:w="2880"/>
+          </w:tcPr>
+          <w:p>
+            <w:r>
+              <w:t>Hasil 1 vs 6 vs 12 utas</w:t>
+            </w:r>
+          </w:p>
+        </w:tc>
+        <w:tc>
+          <w:tcPr>
+            <w:tcW w:type="dxa" w:w="2880"/>
+          </w:tcPr>
+          <w:p>
+            <w:r>
+              <w:t>identik byte-per-byte</w:t>
+            </w:r>
+          </w:p>
+        </w:tc>
+        <w:tc>
+          <w:tcPr>
+            <w:tcW w:type="dxa" w:w="2880"/>
+          </w:tcPr>
+          <w:p>
+            <w:r>
+              <w:t>jumlah utas tidak pernah mengubah angka</w:t>
+            </w:r>
+          </w:p>
+        </w:tc>
+      </w:tr>
+      <w:tr>
+        <w:tc>
+          <w:tcPr>
+            <w:tcW w:type="dxa" w:w="2880"/>
+          </w:tcPr>
+          <w:p>
+            <w:r>
+              <w:t>Dua run beban penuh</w:t>
+            </w:r>
+          </w:p>
+        </w:tc>
+        <w:tc>
+          <w:tcPr>
+            <w:tcW w:type="dxa" w:w="2880"/>
+          </w:tcPr>
+          <w:p>
+            <w:r>
+              <w:t>identik byte-per-byte</w:t>
+            </w:r>
+          </w:p>
+        </w:tc>
+        <w:tc>
+          <w:tcPr>
+            <w:tcW w:type="dxa" w:w="2880"/>
+          </w:tcPr>
+          <w:p>
+            <w:r>
+              <w:t>deterministik sampai skala maksimum</w:t>
+            </w:r>
+          </w:p>
+        </w:tc>
+      </w:tr>
+      <w:tr>
+        <w:tc>
+          <w:tcPr>
+            <w:tcW w:type="dxa" w:w="2880"/>
+          </w:tcPr>
+          <w:p>
+            <w:r>
+              <w:t>Setengah-lebar interval terlebar</w:t>
+            </w:r>
+          </w:p>
+        </w:tc>
+        <w:tc>
+          <w:tcPr>
+            <w:tcW w:type="dxa" w:w="2880"/>
+          </w:tcPr>
+          <w:p>
+            <w:r>
+              <w:t>0,0752 poin (janji: ≤ 0,1)</w:t>
+            </w:r>
+          </w:p>
+        </w:tc>
+        <w:tc>
+          <w:tcPr>
+            <w:tcW w:type="dxa" w:w="2880"/>
+          </w:tcPr>
+          <w:p>
+            <w:r>
+              <w:t>klaim ±0,1% pada tier ini terbukti, bukan perkiraan</w:t>
+            </w:r>
+          </w:p>
+        </w:tc>
+      </w:tr>
+      <w:tr>
+        <w:tc>
+          <w:tcPr>
+            <w:tcW w:type="dxa" w:w="2880"/>
+          </w:tcPr>
+          <w:p>
+            <w:r>
+              <w:t>Konservasi</w:t>
+            </w:r>
+          </w:p>
+        </w:tc>
+        <w:tc>
+          <w:tcPr>
+            <w:tcW w:type="dxa" w:w="2880"/>
+          </w:tcPr>
+          <w:p>
+            <w:r>
+              <w:t>wins + losses == 1.700.000 dan conserved: true pada semua 7 langkah</w:t>
+            </w:r>
+          </w:p>
+        </w:tc>
+        <w:tc>
+          <w:tcPr>
+            <w:tcW w:type="dxa" w:w="2880"/>
+          </w:tcPr>
+          <w:p>
+            <w:r>
+              <w:t>tidak ada kartu atau gim yang hilang karena bebannya besar</w:t>
+            </w:r>
+          </w:p>
+        </w:tc>
+      </w:tr>
+    </w:tbl>
+    <w:p>
+      <w:r>
+        <w:rPr>
+          <w:b w:val="0"/>
+          <w:i w:val="0"/>
+        </w:rPr>
+        <w:t xml:space="preserve">Beban besar juga diuji dari sisi yang paling mudah dilupakan: </w:t>
+      </w:r>
+      <w:r>
+        <w:rPr>
+          <w:b/>
+          <w:i w:val="0"/>
+        </w:rPr>
+        <w:t>apakah aplikasinya masih enak dipakai selagi mesin bekerja?</w:t>
+      </w:r>
+      <w:r>
+        <w:rPr>
+          <w:b w:val="0"/>
+          <w:i w:val="0"/>
+        </w:rPr>
+        <w:t xml:space="preserve"> Selama run 22 detik yang memakai seluruh 12 utas, antarmuka diukur langsung: </w:t>
+      </w:r>
+      <w:r>
+        <w:rPr>
+          <w:b/>
+          <w:i w:val="0"/>
+        </w:rPr>
+        <w:t>59 frame/detik</w:t>
+      </w:r>
+      <w:r>
+        <w:rPr>
+          <w:b w:val="0"/>
+          <w:i w:val="0"/>
+        </w:rPr>
+        <w:t xml:space="preserve"> (frame terburuk 30 ms) dan satu interaksi nyata (mengganti jumlah pemain, termasuk menggambar ulang) selesai dalam </w:t>
+      </w:r>
+      <w:r>
+        <w:rPr>
+          <w:b/>
+          <w:i w:val="0"/>
+        </w:rPr>
+        <w:t>18 ms</w:t>
+      </w:r>
+      <w:r>
+        <w:rPr>
+          <w:b w:val="0"/>
+          <w:i w:val="0"/>
+        </w:rPr>
+        <w:t xml:space="preserve">. Server tetap melayani endpoint ringan seperti </w:t>
+      </w:r>
+      <w:r>
+        <w:rPr>
+          <w:rFonts w:ascii="Consolas" w:hAnsi="Consolas"/>
+          <w:b w:val="0"/>
+          <w:i w:val="0"/>
+          <w:sz w:val="19"/>
+        </w:rPr>
+        <w:t>/api/meta</w:t>
+      </w:r>
+      <w:r>
+        <w:rPr>
+          <w:b w:val="0"/>
+          <w:i w:val="0"/>
+        </w:rPr>
+        <w:t xml:space="preserve"> tanpa masuk ke antrean mesin, karena endpoint itu memang tidak memanggil mesin. Yang berat tetap dibatasi: </w:t>
+      </w:r>
+      <w:r>
+        <w:rPr>
+          <w:rFonts w:ascii="Consolas" w:hAnsi="Consolas"/>
+          <w:b w:val="0"/>
+          <w:i w:val="0"/>
+          <w:sz w:val="19"/>
+        </w:rPr>
+        <w:t>numSims</w:t>
+      </w:r>
+      <w:r>
+        <w:rPr>
+          <w:b w:val="0"/>
+          <w:i w:val="0"/>
+        </w:rPr>
+        <w:t xml:space="preserve"> ditangani berurutan (</w:t>
+      </w:r>
+      <w:r>
+        <w:rPr>
+          <w:rFonts w:ascii="Consolas" w:hAnsi="Consolas"/>
+          <w:b w:val="0"/>
+          <w:i w:val="0"/>
+          <w:sz w:val="19"/>
+        </w:rPr>
+        <w:t>DOMINO_MAX_ENGINE</w:t>
+      </w:r>
+      <w:r>
+        <w:rPr>
+          <w:b w:val="0"/>
+          <w:i w:val="0"/>
+        </w:rPr>
+        <w:t>, bawaan 1) dan permintaan yang menunggu lebih dari 60 detik dijawab 503, bukan menggantung selamanya.</w:t>
+      </w:r>
+    </w:p>
+    <w:p>
+      <w:r>
+        <w:rPr>
+          <w:b w:val="0"/>
+          <w:i w:val="0"/>
+        </w:rPr>
+        <w:t xml:space="preserve">Terakhir, jalur yang benar-benar dipakai pengguna: memilih tier 1.700.000 memunculkan peringatan (dan peringatan itu muncul kembali setiap kali pengguna menaikkan tier dari yang lebih ringan), analisis berjalan dengan indikator waktu, tombol Batal mematikan proses dalam ~0,4 detik, dan hasilnya tampil: </w:t>
+      </w:r>
+      <w:r>
+        <w:rPr>
+          <w:b/>
+          <w:i w:val="0"/>
+        </w:rPr>
+        <w:t>7 langkah, interval ±0,03 poin, selesai 15,4 detik</w:t>
+      </w:r>
+      <w:r>
+        <w:rPr>
+          <w:b w:val="0"/>
+          <w:i w:val="0"/>
+        </w:rPr>
+        <w:t xml:space="preserve"> dari perkiraan yang ditampilkan (~19 detik) — perkiraan yang sengaja dibuat sedikit pesimistis.</w:t>
+      </w:r>
+    </w:p>
+    <w:p>
+      <w:pPr>
+        <w:pStyle w:val="Heading2"/>
+      </w:pPr>
+      <w:r>
+        <w:t>Uji antarmuka tanpa kepala (6 tes)</w:t>
+      </w:r>
+    </w:p>
+    <w:p>
+      <w:r>
+        <w:rPr>
+          <w:b w:val="0"/>
+          <w:i w:val="0"/>
+        </w:rPr>
+        <w:t xml:space="preserve">Peramban sungguhan tapi tanpa jendela (Playwright) menjalankan aplikasi yang utuh — server Python, </w:t>
+      </w:r>
+      <w:r>
+        <w:rPr>
+          <w:rFonts w:ascii="Consolas" w:hAnsi="Consolas"/>
+          <w:b w:val="0"/>
+          <w:i w:val="0"/>
+          <w:sz w:val="19"/>
+        </w:rPr>
+        <w:t>web/</w:t>
+      </w:r>
+      <w:r>
+        <w:rPr>
+          <w:b w:val="0"/>
+          <w:i w:val="0"/>
+        </w:rPr>
+        <w:t>, dan mesin C++ — supaya perilaku yang hidup di JavaScript tidak lagi hanya diuji manual:</w:t>
+      </w:r>
+    </w:p>
+    <w:p>
+      <w:pPr>
+        <w:ind w:left="240"/>
+      </w:pPr>
+      <w:r>
+        <w:rPr>
+          <w:rFonts w:ascii="Consolas" w:hAnsi="Consolas"/>
+          <w:sz w:val="17"/>
+        </w:rPr>
+        <w:t>pip install playwright</w:t>
+        <w:br/>
+        <w:t>python tools/test_ui_heavy.py</w:t>
+      </w:r>
+    </w:p>
+    <w:p>
+      <w:r>
+        <w:rPr>
+          <w:b w:val="0"/>
+          <w:i w:val="0"/>
+        </w:rPr>
+        <w:t xml:space="preserve">Paket </w:t>
+      </w:r>
+      <w:r>
+        <w:rPr>
+          <w:rFonts w:ascii="Consolas" w:hAnsi="Consolas"/>
+          <w:b w:val="0"/>
+          <w:i w:val="0"/>
+          <w:sz w:val="19"/>
+        </w:rPr>
+        <w:t>playwright</w:t>
+      </w:r>
+      <w:r>
+        <w:rPr>
+          <w:b w:val="0"/>
+          <w:i w:val="0"/>
+        </w:rPr>
+        <w:t xml:space="preserve"> memakai peramban yang sudah terpasang di komputer (Edge/Chrome), jadi tidak perlu mengunduh Chromium; bila tidak ada peramban sama sekali, uji ini </w:t>
+      </w:r>
+      <w:r>
+        <w:rPr>
+          <w:b/>
+          <w:i w:val="0"/>
+        </w:rPr>
+        <w:t>dilewati</w:t>
+      </w:r>
+      <w:r>
+        <w:rPr>
+          <w:b w:val="0"/>
+          <w:i w:val="0"/>
+        </w:rPr>
+        <w:t xml:space="preserve"> (skip), bukan gagal. Di CI, Chromium dipasang eksplisit pada pekerjaan </w:t>
+      </w:r>
+      <w:r>
+        <w:rPr>
+          <w:rFonts w:ascii="Consolas" w:hAnsi="Consolas"/>
+          <w:b w:val="0"/>
+          <w:i w:val="0"/>
+          <w:sz w:val="19"/>
+        </w:rPr>
+        <w:t>ui-headless</w:t>
+      </w:r>
+      <w:r>
+        <w:rPr>
+          <w:b w:val="0"/>
+          <w:i w:val="0"/>
+        </w:rPr>
+        <w:t>.</w:t>
+      </w:r>
+    </w:p>
+    <w:tbl>
+      <w:tblPr>
+        <w:tblStyle w:val="LightGrid-Accent1"/>
+        <w:tblW w:type="auto" w:w="0"/>
+        <w:tblLook w:firstColumn="1" w:firstRow="1" w:lastColumn="0" w:lastRow="0" w:noHBand="0" w:noVBand="1" w:val="04A0"/>
+      </w:tblPr>
+      <w:tblGrid>
+        <w:gridCol w:w="4320"/>
+        <w:gridCol w:w="4320"/>
+      </w:tblGrid>
+      <w:tr>
+        <w:tc>
+          <w:tcPr>
+            <w:tcW w:type="dxa" w:w="4320"/>
+          </w:tcPr>
+          <w:p>
+            <w:r>
+              <w:rPr>
+                <w:b/>
+              </w:rPr>
+              <w:t>Tes</w:t>
+            </w:r>
+          </w:p>
+        </w:tc>
+        <w:tc>
+          <w:tcPr>
+            <w:tcW w:type="dxa" w:w="4320"/>
+          </w:tcPr>
+          <w:p>
+            <w:r>
+              <w:rPr>
+                <w:b/>
+              </w:rPr>
+              <w:t>Yang dibuktikan</w:t>
+            </w:r>
+          </w:p>
+        </w:tc>
+      </w:tr>
+      <w:tr>
+        <w:tc>
+          <w:tcPr>
+            <w:tcW w:type="dxa" w:w="4320"/>
+          </w:tcPr>
+          <w:p>
+            <w:r>
+              <w:t>test_heavy_option_exists_and_warns_before_use</w:t>
+            </w:r>
+          </w:p>
+        </w:tc>
+        <w:tc>
+          <w:tcPr>
+            <w:tcW w:type="dxa" w:w="4320"/>
+          </w:tcPr>
+          <w:p>
+            <w:r>
+              <w:t>opsi 1.700.000 ada; memilihnya memunculkan dialog berisi jumlah simulasi, perkiraan waktu, dan cara membatalkan; banner serta label sekali-jalan menyala; mode Live padam</w:t>
+            </w:r>
+          </w:p>
+        </w:tc>
+      </w:tr>
+      <w:tr>
+        <w:tc>
+          <w:tcPr>
+            <w:tcW w:type="dxa" w:w="4320"/>
+          </w:tcPr>
+          <w:p>
+            <w:r>
+              <w:t>test_declining_warning_reverts_to_previous_tier</w:t>
+            </w:r>
+          </w:p>
+        </w:tc>
+        <w:tc>
+          <w:tcPr>
+            <w:tcW w:type="dxa" w:w="4320"/>
+          </w:tcPr>
+          <w:p>
+            <w:r>
+              <w:t>menolak dialog mengembalikan tier sebelumnya tanpa mengubah mode Live; menyetujui dialog tetap membuka tier berat</w:t>
+            </w:r>
+          </w:p>
+        </w:tc>
+      </w:tr>
+      <w:tr>
+        <w:tc>
+          <w:tcPr>
+            <w:tcW w:type="dxa" w:w="4320"/>
+          </w:tcPr>
+          <w:p>
+            <w:r>
+              <w:t>test_button_label_always_matches_tier</w:t>
+            </w:r>
+          </w:p>
+        </w:tc>
+        <w:tc>
+          <w:tcPr>
+            <w:tcW w:type="dxa" w:w="4320"/>
+          </w:tcPr>
+          <w:p>
+            <w:r>
+              <w:t>label tombol selalu cocok dengan tier pada kenaikan/penurunan berturut-turut, dan peringatan muncul lagi di setiap kenaikan</w:t>
+            </w:r>
+          </w:p>
+        </w:tc>
+      </w:tr>
+      <w:tr>
+        <w:tc>
+          <w:tcPr>
+            <w:tcW w:type="dxa" w:w="4320"/>
+          </w:tcPr>
+          <w:p>
+            <w:r>
+              <w:t>test_manual_pause_survives_tier_change</w:t>
+            </w:r>
+          </w:p>
+        </w:tc>
+        <w:tc>
+          <w:tcPr>
+            <w:tcW w:type="dxa" w:w="4320"/>
+          </w:tcPr>
+          <w:p>
+            <w:r>
+              <w:t>jeda Live yang dilakukan pengguna sendiri tidak dinyalakan kembali saat tier diturunkan</w:t>
+            </w:r>
+          </w:p>
+        </w:tc>
+      </w:tr>
+      <w:tr>
+        <w:tc>
+          <w:tcPr>
+            <w:tcW w:type="dxa" w:w="4320"/>
+          </w:tcPr>
+          <w:p>
+            <w:r>
+              <w:t>test_heavy_tier_still_warned_after_reload</w:t>
+            </w:r>
+          </w:p>
+        </w:tc>
+        <w:tc>
+          <w:tcPr>
+            <w:tcW w:type="dxa" w:w="4320"/>
+          </w:tcPr>
+          <w:p>
+            <w:r>
+              <w:t>sesi tersimpan pada tier berat tetap menampilkan banner setelah halaman dimuat ulang, tanpa dialog yang menghadang</w:t>
+            </w:r>
+          </w:p>
+        </w:tc>
+      </w:tr>
+      <w:tr>
+        <w:tc>
+          <w:tcPr>
+            <w:tcW w:type="dxa" w:w="4320"/>
+          </w:tcPr>
+          <w:p>
+            <w:r>
+              <w:t>test_cancel_button_stops_engine_process</w:t>
+            </w:r>
+          </w:p>
+        </w:tc>
+        <w:tc>
+          <w:tcPr>
+            <w:tcW w:type="dxa" w:w="4320"/>
+          </w:tcPr>
+          <w:p>
+            <w:r>
+              <w:t>menekan Batal: proses domino_engine benar-benar hilang (~0,4 detik pada mesin uji), server mencatat [engine] dibatalkan, label pulih ke mode sekali-jalan, dan tidak ada hasil yang tampil</w:t>
+            </w:r>
+          </w:p>
+        </w:tc>
+      </w:tr>
+    </w:tbl>
+    <w:p>
+      <w:r>
+        <w:rPr>
+          <w:b w:val="0"/>
+          <w:i w:val="0"/>
+        </w:rPr>
+        <w:t xml:space="preserve">Tes terakhir berjalan dari posisi dengan 5 kandidat langkah (≈10–20 detik pada 1,7 juta simulasi) dan memeriksa bahwa analisis </w:t>
+      </w:r>
+      <w:r>
+        <w:rPr>
+          <w:b/>
+          <w:i w:val="0"/>
+        </w:rPr>
+        <w:t>masih berjalan</w:t>
+      </w:r>
+      <w:r>
+        <w:rPr>
+          <w:b w:val="0"/>
+          <w:i w:val="0"/>
+        </w:rPr>
+        <w:t xml:space="preserve"> tepat sebelum Batal ditekan. Tanpa pemeriksaan itu, uji hanya akan membuktikan analisis yang kebetulan sudah selesai. Dengan uji ini, jalur soket yang sesungguhnya (klien menutup koneksi → server mematikan mesin) ikut terjaga, bukan hanya fungsi internalnya lewat uji unit.</w:t>
+      </w:r>
+    </w:p>
+    <w:p>
+      <w:pPr>
+        <w:pStyle w:val="Heading3"/>
+      </w:pPr>
+      <w:r>
+        <w:t>Uji ini bergigi — dan itu diperiksa</w:t>
+      </w:r>
+    </w:p>
+    <w:p>
+      <w:r>
+        <w:rPr>
+          <w:b w:val="0"/>
+          <w:i w:val="0"/>
+        </w:rPr>
+        <w:t xml:space="preserve">Uji yang selalu hijau tidak membuktikan apa pun, jadi tiap klaim utama diuji dengan </w:t>
+      </w:r>
+      <w:r>
+        <w:rPr>
+          <w:b/>
+          <w:i w:val="0"/>
+        </w:rPr>
+        <w:t>mutasi</w:t>
+      </w:r>
+      <w:r>
+        <w:rPr>
+          <w:b w:val="0"/>
+          <w:i w:val="0"/>
+        </w:rPr>
+        <w:t>: satu aturan dicabut dari kode, dan uji harus gagal dengan gejala yang tepat.</w:t>
+      </w:r>
+    </w:p>
+    <w:tbl>
+      <w:tblPr>
+        <w:tblStyle w:val="LightGrid-Accent1"/>
+        <w:tblW w:type="auto" w:w="0"/>
+        <w:tblLook w:firstColumn="1" w:firstRow="1" w:lastColumn="0" w:lastRow="0" w:noHBand="0" w:noVBand="1" w:val="04A0"/>
+      </w:tblPr>
+      <w:tblGrid>
+        <w:gridCol w:w="4320"/>
+        <w:gridCol w:w="4320"/>
+      </w:tblGrid>
+      <w:tr>
+        <w:tc>
+          <w:tcPr>
+            <w:tcW w:type="dxa" w:w="4320"/>
+          </w:tcPr>
+          <w:p>
+            <w:r>
+              <w:rPr>
+                <w:b/>
+              </w:rPr>
+              <w:t>Mutasi (cacat yang disuntikkan)</w:t>
+            </w:r>
+          </w:p>
+        </w:tc>
+        <w:tc>
+          <w:tcPr>
+            <w:tcW w:type="dxa" w:w="4320"/>
+          </w:tcPr>
+          <w:p>
+            <w:r>
+              <w:rPr>
+                <w:b/>
+              </w:rPr>
+              <w:t>Gejala yang tertangkap</w:t>
+            </w:r>
+          </w:p>
+        </w:tc>
+      </w:tr>
+      <w:tr>
+        <w:tc>
+          <w:tcPr>
+            <w:tcW w:type="dxa" w:w="4320"/>
+          </w:tcPr>
+          <w:p>
+            <w:r>
+              <w:t>label tidak lagi mengikuti tier</w:t>
+            </w:r>
+          </w:p>
+        </w:tc>
+        <w:tc>
+          <w:tcPr>
+            <w:tcW w:type="dxa" w:w="4320"/>
+          </w:tcPr>
+          <w:p>
+            <w:r>
+              <w:t>label harus menandai analisis sekali-jalan, dapat: '▶️ Analisis Live'</w:t>
+            </w:r>
+          </w:p>
+        </w:tc>
+      </w:tr>
+      <w:tr>
+        <w:tc>
+          <w:tcPr>
+            <w:tcW w:type="dxa" w:w="4320"/>
+          </w:tcPr>
+          <w:p>
+            <w:r>
+              <w:t>penolakan dialog tidak mengembalikan tier</w:t>
+            </w:r>
+          </w:p>
+        </w:tc>
+        <w:tc>
+          <w:tcPr>
+            <w:tcW w:type="dxa" w:w="4320"/>
+          </w:tcPr>
+          <w:p>
+            <w:r>
+              <w:t>'1700000' != '50000'</w:t>
+            </w:r>
+          </w:p>
+        </w:tc>
+      </w:tr>
+      <w:tr>
+        <w:tc>
+          <w:tcPr>
+            <w:tcW w:type="dxa" w:w="4320"/>
+          </w:tcPr>
+          <w:p>
+            <w:r>
+              <w:t>tier berat tidak lagi mematikan Live</w:t>
+            </w:r>
+          </w:p>
+        </w:tc>
+        <w:tc>
+          <w:tcPr>
+            <w:tcW w:type="dxa" w:w="4320"/>
+          </w:tcPr>
+          <w:p>
+            <w:r>
+              <w:t>label harus menandai analisis sekali-jalan, dapat: '⏸ Jeda Live'</w:t>
+            </w:r>
+          </w:p>
+        </w:tc>
+      </w:tr>
+      <w:tr>
+        <w:tc>
+          <w:tcPr>
+            <w:tcW w:type="dxa" w:w="4320"/>
+          </w:tcPr>
+          <w:p>
+            <w:r>
+              <w:t>server mengabaikan koneksi yang ditutup klien</w:t>
+            </w:r>
+          </w:p>
+        </w:tc>
+        <w:tc>
+          <w:tcPr>
+            <w:tcW w:type="dxa" w:w="4320"/>
+          </w:tcPr>
+          <w:p>
+            <w:r>
+              <w:t>proses mesin masih hidup &gt; 8 detik setelah Batal</w:t>
+            </w:r>
+          </w:p>
+        </w:tc>
+      </w:tr>
+    </w:tbl>
+    <w:p>
+      <w:r>
+        <w:rPr>
+          <w:b w:val="0"/>
+          <w:i w:val="0"/>
+        </w:rPr>
+        <w:t>Setelah kode dipulihkan, keenam uji kembali lulus.</w:t>
+      </w:r>
+    </w:p>
+    <w:p>
+      <w:pPr>
+        <w:pStyle w:val="Heading2"/>
+      </w:pPr>
+      <w:r>
+        <w:t>Integrasi berkelanjutan (CI)</w:t>
+      </w:r>
+    </w:p>
+    <w:p>
+      <w:r>
+        <w:rPr>
+          <w:b w:val="0"/>
+          <w:i w:val="0"/>
+        </w:rPr>
+        <w:t xml:space="preserve">Setiap kali perubahan dikirim ke cabang </w:t>
+      </w:r>
+      <w:r>
+        <w:rPr>
+          <w:rFonts w:ascii="Consolas" w:hAnsi="Consolas"/>
+          <w:b w:val="0"/>
+          <w:i w:val="0"/>
+          <w:sz w:val="19"/>
+        </w:rPr>
+        <w:t>main</w:t>
+      </w:r>
+      <w:r>
+        <w:rPr>
+          <w:b w:val="0"/>
+          <w:i w:val="0"/>
+        </w:rPr>
+        <w:t>, empat pekerjaan berjalan di GitHub Actions:</w:t>
+      </w:r>
+    </w:p>
+    <w:tbl>
+      <w:tblPr>
+        <w:tblStyle w:val="LightGrid-Accent1"/>
+        <w:tblW w:type="auto" w:w="0"/>
+        <w:tblLook w:firstColumn="1" w:firstRow="1" w:lastColumn="0" w:lastRow="0" w:noHBand="0" w:noVBand="1" w:val="04A0"/>
+      </w:tblPr>
+      <w:tblGrid>
+        <w:gridCol w:w="2880"/>
+        <w:gridCol w:w="2880"/>
+        <w:gridCol w:w="2880"/>
+      </w:tblGrid>
+      <w:tr>
+        <w:tc>
+          <w:tcPr>
+            <w:tcW w:type="dxa" w:w="2880"/>
+          </w:tcPr>
+          <w:p>
+            <w:r>
+              <w:rPr>
+                <w:b/>
+              </w:rPr>
               <w:t>Pekerjaan</w:t>
             </w:r>
           </w:p>
@@ -18410,6 +20955,38 @@
           </w:p>
         </w:tc>
       </w:tr>
+      <w:tr>
+        <w:tc>
+          <w:tcPr>
+            <w:tcW w:type="dxa" w:w="2880"/>
+          </w:tcPr>
+          <w:p>
+            <w:r>
+              <w:t>ui-headless</w:t>
+            </w:r>
+          </w:p>
+        </w:tc>
+        <w:tc>
+          <w:tcPr>
+            <w:tcW w:type="dxa" w:w="2880"/>
+          </w:tcPr>
+          <w:p>
+            <w:r>
+              <w:t>Ubuntu + Chromium</w:t>
+            </w:r>
+          </w:p>
+        </w:tc>
+        <w:tc>
+          <w:tcPr>
+            <w:tcW w:type="dxa" w:w="2880"/>
+          </w:tcPr>
+          <w:p>
+            <w:r>
+              <w:t>uji antarmuka tanpa kepala untuk tier 1,7 juta</w:t>
+            </w:r>
+          </w:p>
+        </w:tc>
+      </w:tr>
     </w:tbl>
     <w:p>
       <w:r>
@@ -18417,7 +20994,7 @@
           <w:b w:val="0"/>
           <w:i w:val="0"/>
         </w:rPr>
-        <w:t>Tiga pekerjaan ini menjawab tiga pertanyaan berbeda:</w:t>
+        <w:t>Empat pekerjaan ini menjawab empat pertanyaan berbeda:</w:t>
       </w:r>
     </w:p>
     <w:p>
@@ -18493,6 +21070,34 @@
           <w:i w:val="0"/>
         </w:rPr>
         <w:t>kontrak status HTTP tidak bergantung pada biner yang ada.</w:t>
+      </w:r>
+    </w:p>
+    <w:p>
+      <w:pPr>
+        <w:pStyle w:val="ListNumber"/>
+      </w:pPr>
+      <w:r>
+        <w:rPr>
+          <w:b/>
+          <w:i w:val="0"/>
+        </w:rPr>
+        <w:t>Apakah alur tier berat tetap benar dari sisi pengguna?</w:t>
+      </w:r>
+      <w:r>
+        <w:rPr>
+          <w:b w:val="0"/>
+          <w:i w:val="0"/>
+        </w:rPr>
+        <w:t xml:space="preserve"> Ini menjalankan peramban</w:t>
+      </w:r>
+    </w:p>
+    <w:p>
+      <w:r>
+        <w:rPr>
+          <w:b w:val="0"/>
+          <w:i w:val="0"/>
+        </w:rPr>
+        <w:t>sungguhan yang menekan tombol-tombolnya: peringatan, penolakan, label, dan Batal yang mematikan proses mesin.</w:t>
       </w:r>
     </w:p>
     <w:p>
@@ -18926,23 +21531,23 @@
           <w:b/>
           <w:i w:val="0"/>
         </w:rPr>
-        <w:t>Interaksi pengguna belum diuji otomatis.</w:t>
-      </w:r>
-      <w:r>
-        <w:rPr>
-          <w:b w:val="0"/>
-          <w:i w:val="0"/>
-        </w:rPr>
-        <w:t xml:space="preserve"> Modal, masukan cepat, dan alur Undo diuji</w:t>
-      </w:r>
-    </w:p>
-    <w:p>
-      <w:r>
-        <w:rPr>
-          <w:b w:val="0"/>
-          <w:i w:val="0"/>
-        </w:rPr>
-        <w:t>manual.</w:t>
+        <w:t>Sebagian interaksi pengguna kini dijaga otomatis, sebagian belum.</w:t>
+      </w:r>
+      <w:r>
+        <w:rPr>
+          <w:b w:val="0"/>
+          <w:i w:val="0"/>
+        </w:rPr>
+        <w:t xml:space="preserve"> Alur tier</w:t>
+      </w:r>
+    </w:p>
+    <w:p>
+      <w:r>
+        <w:rPr>
+          <w:b w:val="0"/>
+          <w:i w:val="0"/>
+        </w:rPr>
+        <w:t>1,7 juta (peringatan, penolakan, label, Batal yang mematikan mesin) dijaga uji peramban tanpa kepala; modal, masukan cepat, dan alur Undo masih diuji manual.</w:t>
       </w:r>
     </w:p>
     <w:p>
@@ -19035,7 +21640,23 @@
           <w:b w:val="0"/>
           <w:i w:val="0"/>
         </w:rPr>
-        <w:t>Bila Anda ingin menambah pengujian, sasaran yang paling berharga saat ini adalah uji otomatis untuk tata letak papan (misalnya dengan peramban tanpa kepala) dan uji interaksi dasar untuk alur kartu → PASS → atribusi → Undo.</w:t>
+        <w:t xml:space="preserve">Bila Anda ingin menambah pengujian, sasaran yang paling berharga saat ini adalah uji otomatis untuk tata letak papan dan uji interaksi dasar untuk alur kartu → PASS → atribusi → Undo (fondasi peramban tanpa kepala untuk itu sudah ada di </w:t>
+      </w:r>
+      <w:r>
+        <w:rPr>
+          <w:rFonts w:ascii="Consolas" w:hAnsi="Consolas"/>
+          <w:b w:val="0"/>
+          <w:i w:val="0"/>
+          <w:sz w:val="19"/>
+        </w:rPr>
+        <w:t>tools/test_ui_heavy.py</w:t>
+      </w:r>
+      <w:r>
+        <w:rPr>
+          <w:b w:val="0"/>
+          <w:i w:val="0"/>
+        </w:rPr>
+        <w:t>).</w:t>
       </w:r>
     </w:p>
     <w:p>
@@ -20150,7 +22771,7 @@
           </w:tcPr>
           <w:p>
             <w:r>
-              <w:t>Memakai 500 simulasi lalu memercayai selisih 2%</w:t>
+              <w:t>Memakai 1000 simulasi lalu memercayai selisih 2%</w:t>
             </w:r>
           </w:p>
         </w:tc>
@@ -20170,7 +22791,7 @@
           </w:tcPr>
           <w:p>
             <w:r>
-              <w:t>naikkan ke 2000, atau lihat interval keyakinan</w:t>
+              <w:t>naikkan ke 10.000, atau lihat interval keyakinan</w:t>
             </w:r>
           </w:p>
         </w:tc>
@@ -20599,7 +23220,7 @@
           </w:tcPr>
           <w:p>
             <w:r>
-              <w:t>numSims antara 1 dan 10000; mesin dihentikan bila melewati 300 detik</w:t>
+              <w:t>numSims antara 1 dan 1700000; mesin dihentikan bila melewati 300 detik</w:t>
             </w:r>
           </w:p>
         </w:tc>
@@ -21564,7 +24185,7 @@
           </w:tcPr>
           <w:p>
             <w:r>
-              <w:t>1000</w:t>
+              <w:t>10000</w:t>
             </w:r>
           </w:p>
         </w:tc>
@@ -21574,7 +24195,7 @@
           </w:tcPr>
           <w:p>
             <w:r>
-              <w:t>jumlah simulasi per kandidat langkah (1 sampai 10000)</w:t>
+              <w:t>jumlah simulasi per kandidat langkah (1 sampai 1700000)</w:t>
             </w:r>
           </w:p>
         </w:tc>
@@ -21958,6 +24579,428 @@
         </w:tc>
       </w:tr>
     </w:tbl>
+    <w:p>
+      <w:pPr>
+        <w:pStyle w:val="Heading3"/>
+      </w:pPr>
+      <w:r>
+        <w:t>Tier akurasi numSims (varians maksimum, p = 0,5)</w:t>
+      </w:r>
+    </w:p>
+    <w:tbl>
+      <w:tblPr>
+        <w:tblStyle w:val="LightGrid-Accent1"/>
+        <w:tblW w:type="auto" w:w="0"/>
+        <w:tblLook w:firstColumn="1" w:firstRow="1" w:lastColumn="0" w:lastRow="0" w:noHBand="0" w:noVBand="1" w:val="04A0"/>
+      </w:tblPr>
+      <w:tblGrid>
+        <w:gridCol w:w="2160"/>
+        <w:gridCol w:w="2160"/>
+        <w:gridCol w:w="2160"/>
+        <w:gridCol w:w="2160"/>
+      </w:tblGrid>
+      <w:tr>
+        <w:tc>
+          <w:tcPr>
+            <w:tcW w:type="dxa" w:w="2160"/>
+          </w:tcPr>
+          <w:p>
+            <w:r>
+              <w:rPr>
+                <w:b/>
+              </w:rPr>
+              <w:t>Tingkat kepercayaan</w:t>
+            </w:r>
+          </w:p>
+        </w:tc>
+        <w:tc>
+          <w:tcPr>
+            <w:tcW w:type="dxa" w:w="2160"/>
+          </w:tcPr>
+          <w:p>
+            <w:r>
+              <w:rPr>
+                <w:b/>
+              </w:rPr>
+              <w:t>Margin of error</w:t>
+            </w:r>
+          </w:p>
+        </w:tc>
+        <w:tc>
+          <w:tcPr>
+            <w:tcW w:type="dxa" w:w="2160"/>
+          </w:tcPr>
+          <w:p>
+            <w:r>
+              <w:rPr>
+                <w:b/>
+              </w:rPr>
+              <w:t>Jumlah simulasi minimal</w:t>
+            </w:r>
+          </w:p>
+        </w:tc>
+        <w:tc>
+          <w:tcPr>
+            <w:tcW w:type="dxa" w:w="2160"/>
+          </w:tcPr>
+          <w:p>
+            <w:r>
+              <w:rPr>
+                <w:b/>
+              </w:rPr>
+              <w:t>Tier di aplikasi</w:t>
+            </w:r>
+          </w:p>
+        </w:tc>
+      </w:tr>
+      <w:tr>
+        <w:tc>
+          <w:tcPr>
+            <w:tcW w:type="dxa" w:w="2160"/>
+          </w:tcPr>
+          <w:p>
+            <w:r>
+              <w:t>95%</w:t>
+            </w:r>
+          </w:p>
+        </w:tc>
+        <w:tc>
+          <w:tcPr>
+            <w:tcW w:type="dxa" w:w="2160"/>
+          </w:tcPr>
+          <w:p>
+            <w:r>
+              <w:t>±3,1%</w:t>
+            </w:r>
+          </w:p>
+        </w:tc>
+        <w:tc>
+          <w:tcPr>
+            <w:tcW w:type="dxa" w:w="2160"/>
+          </w:tcPr>
+          <w:p>
+            <w:r>
+              <w:t>~1.000</w:t>
+            </w:r>
+          </w:p>
+        </w:tc>
+        <w:tc>
+          <w:tcPr>
+            <w:tcW w:type="dxa" w:w="2160"/>
+          </w:tcPr>
+          <w:p>
+            <w:r>
+              <w:t>1.000 (cepat)</w:t>
+            </w:r>
+          </w:p>
+        </w:tc>
+      </w:tr>
+      <w:tr>
+        <w:tc>
+          <w:tcPr>
+            <w:tcW w:type="dxa" w:w="2160"/>
+          </w:tcPr>
+          <w:p>
+            <w:r>
+              <w:t>95%</w:t>
+            </w:r>
+          </w:p>
+        </w:tc>
+        <w:tc>
+          <w:tcPr>
+            <w:tcW w:type="dxa" w:w="2160"/>
+          </w:tcPr>
+          <w:p>
+            <w:r>
+              <w:t>±1,4%</w:t>
+            </w:r>
+          </w:p>
+        </w:tc>
+        <w:tc>
+          <w:tcPr>
+            <w:tcW w:type="dxa" w:w="2160"/>
+          </w:tcPr>
+          <w:p>
+            <w:r>
+              <w:t>~5.000</w:t>
+            </w:r>
+          </w:p>
+        </w:tc>
+        <w:tc>
+          <w:tcPr>
+            <w:tcW w:type="dxa" w:w="2160"/>
+          </w:tcPr>
+          <w:p>
+            <w:r>
+              <w:t>5.000</w:t>
+            </w:r>
+          </w:p>
+        </w:tc>
+      </w:tr>
+      <w:tr>
+        <w:tc>
+          <w:tcPr>
+            <w:tcW w:type="dxa" w:w="2160"/>
+          </w:tcPr>
+          <w:p>
+            <w:r>
+              <w:t>95%</w:t>
+            </w:r>
+          </w:p>
+        </w:tc>
+        <w:tc>
+          <w:tcPr>
+            <w:tcW w:type="dxa" w:w="2160"/>
+          </w:tcPr>
+          <w:p>
+            <w:r>
+              <w:t>±1,0%</w:t>
+            </w:r>
+          </w:p>
+        </w:tc>
+        <w:tc>
+          <w:tcPr>
+            <w:tcW w:type="dxa" w:w="2160"/>
+          </w:tcPr>
+          <w:p>
+            <w:r>
+              <w:t>9.604 (≈10 ribu)</w:t>
+            </w:r>
+          </w:p>
+        </w:tc>
+        <w:tc>
+          <w:tcPr>
+            <w:tcW w:type="dxa" w:w="2160"/>
+          </w:tcPr>
+          <w:p>
+            <w:r>
+              <w:t>10.000 (bawaan)</w:t>
+            </w:r>
+          </w:p>
+        </w:tc>
+      </w:tr>
+      <w:tr>
+        <w:tc>
+          <w:tcPr>
+            <w:tcW w:type="dxa" w:w="2160"/>
+          </w:tcPr>
+          <w:p>
+            <w:r>
+              <w:t>95%</w:t>
+            </w:r>
+          </w:p>
+        </w:tc>
+        <w:tc>
+          <w:tcPr>
+            <w:tcW w:type="dxa" w:w="2160"/>
+          </w:tcPr>
+          <w:p>
+            <w:r>
+              <w:t>±0,44%</w:t>
+            </w:r>
+          </w:p>
+        </w:tc>
+        <w:tc>
+          <w:tcPr>
+            <w:tcW w:type="dxa" w:w="2160"/>
+          </w:tcPr>
+          <w:p>
+            <w:r>
+              <w:t>~50.000</w:t>
+            </w:r>
+          </w:p>
+        </w:tc>
+        <w:tc>
+          <w:tcPr>
+            <w:tcW w:type="dxa" w:w="2160"/>
+          </w:tcPr>
+          <w:p>
+            <w:r>
+              <w:t>50.000</w:t>
+            </w:r>
+          </w:p>
+        </w:tc>
+      </w:tr>
+      <w:tr>
+        <w:tc>
+          <w:tcPr>
+            <w:tcW w:type="dxa" w:w="2160"/>
+          </w:tcPr>
+          <w:p>
+            <w:r>
+              <w:t>95%</w:t>
+            </w:r>
+          </w:p>
+        </w:tc>
+        <w:tc>
+          <w:tcPr>
+            <w:tcW w:type="dxa" w:w="2160"/>
+          </w:tcPr>
+          <w:p>
+            <w:r>
+              <w:t>±0,1%</w:t>
+            </w:r>
+          </w:p>
+        </w:tc>
+        <w:tc>
+          <w:tcPr>
+            <w:tcW w:type="dxa" w:w="2160"/>
+          </w:tcPr>
+          <w:p>
+            <w:r>
+              <w:t>960.400 (≈1 juta)</w:t>
+            </w:r>
+          </w:p>
+        </w:tc>
+        <w:tc>
+          <w:tcPr>
+            <w:tcW w:type="dxa" w:w="2160"/>
+          </w:tcPr>
+          <w:p>
+            <w:r>
+              <w:t>dicakup oleh tier 1.700.000</w:t>
+            </w:r>
+          </w:p>
+        </w:tc>
+      </w:tr>
+      <w:tr>
+        <w:tc>
+          <w:tcPr>
+            <w:tcW w:type="dxa" w:w="2160"/>
+          </w:tcPr>
+          <w:p>
+            <w:r>
+              <w:t>99%</w:t>
+            </w:r>
+          </w:p>
+        </w:tc>
+        <w:tc>
+          <w:tcPr>
+            <w:tcW w:type="dxa" w:w="2160"/>
+          </w:tcPr>
+          <w:p>
+            <w:r>
+              <w:t>±0,1%</w:t>
+            </w:r>
+          </w:p>
+        </w:tc>
+        <w:tc>
+          <w:tcPr>
+            <w:tcW w:type="dxa" w:w="2160"/>
+          </w:tcPr>
+          <w:p>
+            <w:r>
+              <w:t>1.664.100 (≈1,7 juta)</w:t>
+            </w:r>
+          </w:p>
+        </w:tc>
+        <w:tc>
+          <w:tcPr>
+            <w:tcW w:type="dxa" w:w="2160"/>
+          </w:tcPr>
+          <w:p>
+            <w:r>
+              <w:t>1.700.000 (dengan peringatan; lihat bab antarmuka)</w:t>
+            </w:r>
+          </w:p>
+        </w:tc>
+      </w:tr>
+      <w:tr>
+        <w:tc>
+          <w:tcPr>
+            <w:tcW w:type="dxa" w:w="2160"/>
+          </w:tcPr>
+          <w:p>
+            <w:r>
+              <w:t>99%</w:t>
+            </w:r>
+          </w:p>
+        </w:tc>
+        <w:tc>
+          <w:tcPr>
+            <w:tcW w:type="dxa" w:w="2160"/>
+          </w:tcPr>
+          <w:p>
+            <w:r>
+              <w:t>±0,01%</w:t>
+            </w:r>
+          </w:p>
+        </w:tc>
+        <w:tc>
+          <w:tcPr>
+            <w:tcW w:type="dxa" w:w="2160"/>
+          </w:tcPr>
+          <w:p>
+            <w:r>
+              <w:t>166.410.000 (≈166 juta)</w:t>
+            </w:r>
+          </w:p>
+        </w:tc>
+        <w:tc>
+          <w:tcPr>
+            <w:tcW w:type="dxa" w:w="2160"/>
+          </w:tcPr>
+          <w:p>
+            <w:r>
+              <w:t>tidak ditawarkan — berjam-jam per permintaan</w:t>
+            </w:r>
+          </w:p>
+        </w:tc>
+      </w:tr>
+    </w:tbl>
+    <w:p>
+      <w:r>
+        <w:rPr>
+          <w:b w:val="0"/>
+          <w:i w:val="0"/>
+        </w:rPr>
+        <w:t xml:space="preserve">Rumus: N = Z² × p(1−p) / E², dengan Z = 1,96 (95%) atau 2,58 (99%). Pada mesin uji (6 inti fisik / 12 utas logis) mesin mengerjakan ~0,6–1,4 juta simulasi-langkah per detik (lihat </w:t>
+      </w:r>
+      <w:r>
+        <w:rPr>
+          <w:rFonts w:ascii="Consolas" w:hAnsi="Consolas"/>
+          <w:b w:val="0"/>
+          <w:i w:val="0"/>
+          <w:sz w:val="19"/>
+        </w:rPr>
+        <w:t>tools/bench_engine.py</w:t>
+      </w:r>
+      <w:r>
+        <w:rPr>
+          <w:b w:val="0"/>
+          <w:i w:val="0"/>
+        </w:rPr>
+        <w:t xml:space="preserve">), sehingga tier 1.700.000 memakan </w:t>
+      </w:r>
+      <w:r>
+        <w:rPr>
+          <w:b/>
+          <w:i w:val="0"/>
+        </w:rPr>
+        <w:t>7 detik</w:t>
+      </w:r>
+      <w:r>
+        <w:rPr>
+          <w:b w:val="0"/>
+          <w:i w:val="0"/>
+        </w:rPr>
+        <w:t xml:space="preserve"> untuk 3 kandidat langkah dan </w:t>
+      </w:r>
+      <w:r>
+        <w:rPr>
+          <w:b/>
+          <w:i w:val="0"/>
+        </w:rPr>
+        <w:t>~30 detik</w:t>
+      </w:r>
+      <w:r>
+        <w:rPr>
+          <w:b w:val="0"/>
+          <w:i w:val="0"/>
+        </w:rPr>
+        <w:t xml:space="preserve"> untuk 12 kandidat langkah; efisiensi paralelnya 87% dari 6 inti fisik. Karena itu tier ini tidak berjalan otomatis: antarmuka meminta konfirmasi, mematikan mode Live, dan menyediakan tombol Batal yang benar-benar menghentikan proses mesin.</w:t>
+      </w:r>
+    </w:p>
     <w:p>
       <w:pPr>
         <w:pStyle w:val="Heading3"/>
@@ -23937,7 +26980,7 @@
           </w:tcPr>
           <w:p>
             <w:r>
-              <w:t>numSims harus angka 1..10000</w:t>
+              <w:t>numSims harus angka 1..1700000</w:t>
             </w:r>
           </w:p>
         </w:tc>
@@ -24506,7 +27549,7 @@
           </w:tcPr>
           <w:p>
             <w:r>
-              <w:t>tetap ketat; numSims dibatasi 1 sampai 10000 di dalam mesin</w:t>
+              <w:t>tetap ketat; numSims dibatasi 1 sampai 1700000 di dalam mesin</w:t>
             </w:r>
           </w:p>
         </w:tc>
@@ -28158,7 +31201,7 @@
           <w:b w:val="0"/>
           <w:i w:val="0"/>
         </w:rPr>
-        <w:t xml:space="preserve"> — 27 uji server harus lulus;</w:t>
+        <w:t xml:space="preserve"> — 29 uji server harus lulus;</w:t>
       </w:r>
     </w:p>
     <w:p>
@@ -28172,6 +31215,98 @@
           <w:i w:val="0"/>
           <w:sz w:val="19"/>
         </w:rPr>
+        <w:t>python tools/test_engine_parallel.py</w:t>
+      </w:r>
+      <w:r>
+        <w:rPr>
+          <w:b w:val="0"/>
+          <w:i w:val="0"/>
+        </w:rPr>
+        <w:t xml:space="preserve"> — 8 uji paralel/determinisme harus lulus</w:t>
+      </w:r>
+    </w:p>
+    <w:p>
+      <w:r>
+        <w:rPr>
+          <w:b w:val="0"/>
+          <w:i w:val="0"/>
+        </w:rPr>
+        <w:t xml:space="preserve">(tambahkan </w:t>
+      </w:r>
+      <w:r>
+        <w:rPr>
+          <w:rFonts w:ascii="Consolas" w:hAnsi="Consolas"/>
+          <w:b w:val="0"/>
+          <w:i w:val="0"/>
+          <w:sz w:val="19"/>
+        </w:rPr>
+        <w:t>DOMINO_SLOW_TESTS=1</w:t>
+      </w:r>
+      <w:r>
+        <w:rPr>
+          <w:b w:val="0"/>
+          <w:i w:val="0"/>
+        </w:rPr>
+        <w:t xml:space="preserve"> untuk ikut menguji beban penuh 1,7 juta simulasi);</w:t>
+      </w:r>
+    </w:p>
+    <w:p>
+      <w:pPr>
+        <w:pStyle w:val="ListNumber"/>
+      </w:pPr>
+      <w:r>
+        <w:rPr>
+          <w:rFonts w:ascii="Consolas" w:hAnsi="Consolas"/>
+          <w:b w:val="0"/>
+          <w:i w:val="0"/>
+          <w:sz w:val="19"/>
+        </w:rPr>
+        <w:t>python tools/test_ui_heavy.py</w:t>
+      </w:r>
+      <w:r>
+        <w:rPr>
+          <w:b w:val="0"/>
+          <w:i w:val="0"/>
+        </w:rPr>
+        <w:t xml:space="preserve"> — 6 uji antarmuka tanpa kepala untuk tier 1,7 juta harus</w:t>
+      </w:r>
+    </w:p>
+    <w:p>
+      <w:r>
+        <w:rPr>
+          <w:b w:val="0"/>
+          <w:i w:val="0"/>
+        </w:rPr>
+        <w:t xml:space="preserve">lulus (perlu </w:t>
+      </w:r>
+      <w:r>
+        <w:rPr>
+          <w:rFonts w:ascii="Consolas" w:hAnsi="Consolas"/>
+          <w:b w:val="0"/>
+          <w:i w:val="0"/>
+          <w:sz w:val="19"/>
+        </w:rPr>
+        <w:t>pip install playwright</w:t>
+      </w:r>
+      <w:r>
+        <w:rPr>
+          <w:b w:val="0"/>
+          <w:i w:val="0"/>
+        </w:rPr>
+        <w:t>; dilewati bila tidak ada peramban);</w:t>
+      </w:r>
+    </w:p>
+    <w:p>
+      <w:pPr>
+        <w:pStyle w:val="ListNumber"/>
+      </w:pPr>
+      <w:r>
+        <w:rPr>
+          <w:rFonts w:ascii="Consolas" w:hAnsi="Consolas"/>
+          <w:b w:val="0"/>
+          <w:i w:val="0"/>
+          <w:sz w:val="19"/>
+        </w:rPr>
         <w:t>python tools/build_engine.py --force</w:t>
       </w:r>
       <w:r>
@@ -28188,7 +31323,23 @@
           <w:b w:val="0"/>
           <w:i w:val="0"/>
         </w:rPr>
-        <w:t>Perubahan pada tata letak papan atau interaksi antarmuka sebaiknya disertai pemeriksaan manual pada lebar ponsel dan desktop, karena bagian itu belum punya uji otomatis.</w:t>
+        <w:t xml:space="preserve">Perubahan pada tata letak papan sebaiknya disertai pemeriksaan manual pada lebar ponsel dan desktop, karena tata letak belum punya uji otomatis. Perubahan pada alur tier 1,7 juta (peringatan, label tombol, pembatalan) sudah punya pengaman otomatis — jalankan </w:t>
+      </w:r>
+      <w:r>
+        <w:rPr>
+          <w:rFonts w:ascii="Consolas" w:hAnsi="Consolas"/>
+          <w:b w:val="0"/>
+          <w:i w:val="0"/>
+          <w:sz w:val="19"/>
+        </w:rPr>
+        <w:t>tools/test_ui_heavy.py</w:t>
+      </w:r>
+      <w:r>
+        <w:rPr>
+          <w:b w:val="0"/>
+          <w:i w:val="0"/>
+        </w:rPr>
+        <w:t>.</w:t>
       </w:r>
     </w:p>
     <w:p>

</xml_diff>